<commit_message>
docs: translate materials authoring interpretation to Chinese
</commit_message>
<xml_diff>
--- a/output/system_design/materials-benchmark-authoring/materials_benchmark_authoring_system_design.docx
+++ b/output/system_design/materials-benchmark-authoring/materials_benchmark_authoring_system_design.docx
@@ -248,7 +248,7 @@
       </w:pPr>
       <w:r>
         <w:rPr>
-          <w:rFonts w:ascii="Arial Unicode MS" w:cs="Arial Unicode MS" w:eastAsia="Arial Unicode MS" w:hAnsi="Arial Unicode MS"/>
+          <w:rFonts w:ascii="Heiti SC" w:cs="Arial Unicode MS" w:eastAsia="Heiti SC" w:hAnsi="Heiti SC"/>
           <w:b w:val="0"/>
           <w:bCs w:val="0"/>
           <w:color w:val="5E7B92"/>
@@ -256,7 +256,7 @@
           <w:szCs w:val="72"/>
           <w:rtl w:val="0"/>
         </w:rPr>
-        <w:t>Materials Benchmark Authoring</w:t>
+        <w:t>材料基准题目编写</w:t>
       </w:r>
     </w:p>
     <w:p>
@@ -271,14 +271,14 @@
       </w:pPr>
       <w:r>
         <w:rPr>
-          <w:rFonts w:ascii="Arial Unicode MS" w:cs="Arial Unicode MS" w:eastAsia="Arial Unicode MS" w:hAnsi="Arial Unicode MS"/>
+          <w:rFonts w:ascii="Heiti SC" w:cs="Arial Unicode MS" w:eastAsia="Heiti SC" w:hAnsi="Heiti SC"/>
           <w:b/>
           <w:color w:val="0B2948"/>
           <w:sz w:val="56"/>
           <w:szCs w:val="72"/>
           <w:rtl w:val="0"/>
         </w:rPr>
-        <w:t>From Paper PDF to Review-Ready Enhanced Harbor Tasks</w:t>
+        <w:t>从论文PDF到通过独立复审的增强型Harbor题包</w:t>
       </w:r>
     </w:p>
     <w:p>
@@ -461,14 +461,15 @@
             <w:bookmarkEnd w:id="0"/>
             <w:r>
               <w:rPr>
-                <w:rFonts w:ascii="Arial Unicode MS" w:hAnsi="Arial Unicode MS" w:eastAsia="Arial Unicode MS" w:cs="Arial Unicode MS"/>
+                <w:rFonts w:ascii="Heiti SC" w:hAnsi="Heiti SC" w:eastAsia="Heiti SC" w:cs="Arial Unicode MS"/>
                 <w:b/>
                 <w:sz w:val="16"/>
                 <w:rtl w:val="0"/>
               </w:rPr>
-              <w:t>STATUS</w:t>
+              <w:t>状态</w:t>
               <w:br/>
-              <w:t>Proposed</w:t>
+              <w:t>提案</w:t>
+              <w:br/>
             </w:r>
           </w:p>
           <w:p>
@@ -497,6 +498,7 @@
             </w:pPr>
             <w:r>
               <w:rPr>
+                <w:rFonts w:ascii="Heiti SC" w:hAnsi="Heiti SC" w:eastAsia="Heiti SC"/>
                 <w:rtl w:val="0"/>
               </w:rPr>
             </w:r>
@@ -513,14 +515,15 @@
             <w:bookmarkEnd w:id="1"/>
             <w:r>
               <w:rPr>
-                <w:rFonts w:ascii="Arial Unicode MS" w:hAnsi="Arial Unicode MS" w:eastAsia="Arial Unicode MS" w:cs="Arial Unicode MS"/>
+                <w:rFonts w:ascii="Heiti SC" w:hAnsi="Heiti SC" w:eastAsia="Heiti SC" w:cs="Arial Unicode MS"/>
                 <w:b/>
                 <w:sz w:val="16"/>
                 <w:rtl w:val="0"/>
               </w:rPr>
-              <w:t>OWNER</w:t>
+              <w:t>负责人</w:t>
               <w:br/>
               <w:t>MatBenchGuard / qa-review</w:t>
+              <w:br/>
             </w:r>
           </w:p>
           <w:p>
@@ -549,6 +552,7 @@
             </w:pPr>
             <w:r>
               <w:rPr>
+                <w:rFonts w:ascii="Heiti SC" w:hAnsi="Heiti SC" w:eastAsia="Heiti SC"/>
                 <w:rtl w:val="0"/>
               </w:rPr>
             </w:r>
@@ -565,14 +569,15 @@
             <w:bookmarkEnd w:id="2"/>
             <w:r>
               <w:rPr>
-                <w:rFonts w:ascii="Arial Unicode MS" w:hAnsi="Arial Unicode MS" w:eastAsia="Arial Unicode MS" w:cs="Arial Unicode MS"/>
+                <w:rFonts w:ascii="Heiti SC" w:hAnsi="Heiti SC" w:eastAsia="Heiti SC" w:cs="Arial Unicode MS"/>
                 <w:b/>
                 <w:sz w:val="16"/>
                 <w:rtl w:val="0"/>
               </w:rPr>
-              <w:t>LAST UPDATED</w:t>
+              <w:t>最后更新</w:t>
               <w:br/>
-              <w:t>August 3, 2026</w:t>
+              <w:t>2026年8月3日</w:t>
+              <w:br/>
             </w:r>
           </w:p>
           <w:p>
@@ -657,14 +662,14 @@
             </w:pPr>
             <w:r>
               <w:rPr>
-                <w:rFonts w:ascii="Arial Unicode MS" w:cs="Arial Unicode MS" w:eastAsia="Arial Unicode MS" w:hAnsi="Arial Unicode MS"/>
+                <w:rFonts w:ascii="Heiti SC" w:cs="Arial Unicode MS" w:eastAsia="Heiti SC" w:hAnsi="Heiti SC"/>
                 <w:b/>
                 <w:bCs w:val="1"/>
                 <w:color w:val="000000"/>
                 <w:sz w:val="17"/>
                 <w:rtl w:val="0"/>
               </w:rPr>
-              <w:t>Authors</w:t>
+              <w:t>编写者</w:t>
             </w:r>
           </w:p>
         </w:tc>
@@ -693,13 +698,13 @@
             </w:pPr>
             <w:r>
               <w:rPr>
-                <w:rFonts w:ascii="Arial Unicode MS" w:cs="Arial Unicode MS" w:eastAsia="Arial Unicode MS" w:hAnsi="Arial Unicode MS"/>
+                <w:rFonts w:ascii="Heiti SC" w:cs="Arial Unicode MS" w:eastAsia="Heiti SC" w:hAnsi="Heiti SC"/>
                 <w:b/>
                 <w:color w:val="233447"/>
                 <w:sz w:val="17"/>
                 <w:rtl w:val="0"/>
               </w:rPr>
-              <w:t>Codex; MatBenchGuard project team</w:t>
+              <w:t>Codex；MatBenchGuard项目组</w:t>
             </w:r>
           </w:p>
         </w:tc>
@@ -731,14 +736,14 @@
             </w:pPr>
             <w:r>
               <w:rPr>
-                <w:rFonts w:ascii="Arial Unicode MS" w:cs="Arial Unicode MS" w:eastAsia="Arial Unicode MS" w:hAnsi="Arial Unicode MS"/>
+                <w:rFonts w:ascii="Heiti SC" w:cs="Arial Unicode MS" w:eastAsia="Heiti SC" w:hAnsi="Heiti SC"/>
                 <w:b w:val="0"/>
                 <w:bCs w:val="1"/>
                 <w:color w:val="000000"/>
                 <w:sz w:val="17"/>
                 <w:rtl w:val="0"/>
               </w:rPr>
-              <w:t>Reviewers</w:t>
+              <w:t>复审者</w:t>
             </w:r>
           </w:p>
         </w:tc>
@@ -767,13 +772,13 @@
             </w:pPr>
             <w:r>
               <w:rPr>
-                <w:rFonts w:ascii="Arial Unicode MS" w:cs="Arial Unicode MS" w:eastAsia="Arial Unicode MS" w:hAnsi="Arial Unicode MS"/>
-                <w:b w:val="0"/>
-                <w:color w:val="233447"/>
-                <w:sz w:val="17"/>
-                <w:rtl w:val="0"/>
-              </w:rPr>
-              <w:t>Independent Review Agent; materials-science reviewer</w:t>
+                <w:rFonts w:ascii="Heiti SC" w:cs="Arial Unicode MS" w:eastAsia="Heiti SC" w:hAnsi="Heiti SC"/>
+                <w:b w:val="0"/>
+                <w:color w:val="233447"/>
+                <w:sz w:val="17"/>
+                <w:rtl w:val="0"/>
+              </w:rPr>
+              <w:t>独立Review Agent；材料科学复审者</w:t>
             </w:r>
           </w:p>
         </w:tc>
@@ -804,14 +809,14 @@
             </w:pPr>
             <w:r>
               <w:rPr>
-                <w:rFonts w:ascii="Arial Unicode MS" w:cs="Arial Unicode MS" w:eastAsia="Arial Unicode MS" w:hAnsi="Arial Unicode MS"/>
+                <w:rFonts w:ascii="Heiti SC" w:cs="Arial Unicode MS" w:eastAsia="Heiti SC" w:hAnsi="Heiti SC"/>
                 <w:b w:val="0"/>
                 <w:bCs w:val="1"/>
                 <w:color w:val="000000"/>
                 <w:sz w:val="17"/>
                 <w:rtl w:val="0"/>
               </w:rPr>
-              <w:t>Related docs</w:t>
+              <w:t>相关文档</w:t>
             </w:r>
           </w:p>
         </w:tc>
@@ -840,13 +845,13 @@
             </w:pPr>
             <w:r>
               <w:rPr>
-                <w:rFonts w:ascii="Arial Unicode MS" w:cs="Arial Unicode MS" w:eastAsia="Arial Unicode MS" w:hAnsi="Arial Unicode MS"/>
-                <w:b w:val="0"/>
-                <w:color w:val="233447"/>
-                <w:sz w:val="17"/>
-                <w:rtl w:val="0"/>
-              </w:rPr>
-              <w:t>Authoring, Review, and Repair Skills</w:t>
+                <w:rFonts w:ascii="Heiti SC" w:cs="Arial Unicode MS" w:eastAsia="Heiti SC" w:hAnsi="Heiti SC"/>
+                <w:b w:val="0"/>
+                <w:color w:val="233447"/>
+                <w:sz w:val="17"/>
+                <w:rtl w:val="0"/>
+              </w:rPr>
+              <w:t>Authoring、Review与Repair Skills</w:t>
             </w:r>
           </w:p>
         </w:tc>
@@ -877,14 +882,14 @@
             </w:pPr>
             <w:r>
               <w:rPr>
-                <w:rFonts w:ascii="Arial Unicode MS" w:cs="Arial Unicode MS" w:eastAsia="Arial Unicode MS" w:hAnsi="Arial Unicode MS"/>
+                <w:rFonts w:ascii="Heiti SC" w:cs="Arial Unicode MS" w:eastAsia="Heiti SC" w:hAnsi="Heiti SC"/>
                 <w:b w:val="0"/>
                 <w:bCs w:val="1"/>
                 <w:color w:val="000000"/>
                 <w:sz w:val="17"/>
                 <w:rtl w:val="0"/>
               </w:rPr>
-              <w:t>Scope</w:t>
+              <w:t>范围</w:t>
             </w:r>
           </w:p>
         </w:tc>
@@ -913,13 +918,13 @@
             </w:pPr>
             <w:r>
               <w:rPr>
-                <w:rFonts w:ascii="Arial Unicode MS" w:cs="Arial Unicode MS" w:eastAsia="Arial Unicode MS" w:hAnsi="Arial Unicode MS"/>
-                <w:b w:val="0"/>
-                <w:color w:val="233447"/>
-                <w:sz w:val="17"/>
-                <w:rtl w:val="0"/>
-              </w:rPr>
-              <w:t>PDF to paper-Gold-centered RESULT_ENHANCED Paper2Arm task.</w:t>
+                <w:rFonts w:ascii="Heiti SC" w:cs="Arial Unicode MS" w:eastAsia="Heiti SC" w:hAnsi="Heiti SC"/>
+                <w:b w:val="0"/>
+                <w:color w:val="233447"/>
+                <w:sz w:val="17"/>
+                <w:rtl w:val="0"/>
+              </w:rPr>
+              <w:t>从论文PDF生成以paper Gold为中心的RESULT_ENHANCED Paper2Arm题包。</w:t>
             </w:r>
           </w:p>
         </w:tc>
@@ -942,11 +947,11 @@
       </w:pPr>
       <w:r>
         <w:rPr>
-          <w:rFonts w:ascii="Arial Unicode MS" w:cs="Arial Unicode MS" w:eastAsia="Arial Unicode MS" w:hAnsi="Arial Unicode MS"/>
+          <w:rFonts w:ascii="Heiti SC" w:cs="Arial Unicode MS" w:eastAsia="Heiti SC" w:hAnsi="Heiti SC"/>
           <w:color w:val="082a4a"/>
           <w:rtl w:val="0"/>
         </w:rPr>
-        <w:t>1.  Abstract</w:t>
+        <w:t>1.  摘要</w:t>
       </w:r>
     </w:p>
     <w:p>
@@ -959,11 +964,11 @@
       </w:pPr>
       <w:r>
         <w:rPr>
-          <w:rFonts w:ascii="Arial Unicode MS" w:cs="Arial Unicode MS" w:eastAsia="Arial Unicode MS" w:hAnsi="Arial Unicode MS"/>
+          <w:rFonts w:ascii="Heiti SC" w:cs="Arial Unicode MS" w:eastAsia="Heiti SC" w:hAnsi="Heiti SC"/>
           <w:color w:val="233447"/>
           <w:rtl w:val="0"/>
         </w:rPr>
-        <w:t>The system treats materials-science task authoring as an evidence-backed compilation pipeline. It freezes the PDF, uses UniParser to create paper/paper.md, builds a ledger for parameters, condition groups, Gold, and resources, and then enumerates several computational-science candidates. Only candidates that pass Q0, Gold applicability, resource closure, and affordable enhanced-checkpoint gates are compiled into Harbor packages.</w:t>
+        <w:t>本系统把材料科学题包编写视为一条有证据约束的编译流程。流程先冻结论文PDF，使用UniParser生成paper/paper.md，再建立参数、条件组、Gold和资源台账，随后枚举多个计算科学候选问题。只有通过Q0准入、Gold适用性、资源闭环和轻量增强检查点门禁的候选，才会被编译成Harbor题包。</w:t>
       </w:r>
     </w:p>
     <w:p>
@@ -976,11 +981,11 @@
       </w:pPr>
       <w:r>
         <w:rPr>
-          <w:rFonts w:ascii="Arial Unicode MS" w:cs="Arial Unicode MS" w:eastAsia="Arial Unicode MS" w:hAnsi="Arial Unicode MS"/>
+          <w:rFonts w:ascii="Heiti SC" w:cs="Arial Unicode MS" w:eastAsia="Heiti SC" w:hAnsi="Heiti SC"/>
           <w:color w:val="233447"/>
           <w:rtl w:val="0"/>
         </w:rPr>
-        <w:t>The core guarantee is prove authorability before generating the package. Success is not a green local checker; it is PASS + RESULT_ENHANCED from an independent materials-benchmark-review. If no candidate qualifies, the system fails closed as NO_ENHANCED_CANDIDATE instead of deferring defects to large-scale Repair.</w:t>
+        <w:t>核心保证是“先证明可编写，再生成题包”。成功标准不是本地checker变绿，而是独立materials-benchmark-review给出PASS＋RESULT_ENHANCED。若没有候选满足全部门槛，流程以NO_ENHANCED_CANDIDATE封闭失败，不把缺陷推迟给后续大规模Repair。</w:t>
       </w:r>
     </w:p>
     <w:p>
@@ -1006,10 +1011,10 @@
       </w:pPr>
       <w:r>
         <w:rPr>
-          <w:rFonts w:ascii="Arial Unicode MS" w:cs="Arial Unicode MS" w:eastAsia="Arial Unicode MS" w:hAnsi="Arial Unicode MS"/>
+          <w:rFonts w:ascii="Heiti SC" w:cs="Arial Unicode MS" w:eastAsia="Heiti SC" w:hAnsi="Heiti SC"/>
           <w:rtl w:val="0"/>
         </w:rPr>
-        <w:t>2.  Goals and Non-Goals</w:t>
+        <w:t>2.  目标与非目标</w:t>
       </w:r>
     </w:p>
     <w:tbl>
@@ -1069,14 +1074,14 @@
             </w:pPr>
             <w:r>
               <w:rPr>
-                <w:rFonts w:ascii="Arial Unicode MS" w:cs="Arial Unicode MS" w:eastAsia="Arial Unicode MS" w:hAnsi="Arial Unicode MS"/>
+                <w:rFonts w:ascii="Heiti SC" w:cs="Arial Unicode MS" w:eastAsia="Heiti SC" w:hAnsi="Heiti SC"/>
                 <w:b/>
                 <w:bCs w:val="1"/>
                 <w:color w:val="ffffff"/>
                 <w:sz w:val="17"/>
                 <w:rtl w:val="0"/>
               </w:rPr>
-              <w:t>Goals</w:t>
+              <w:t>目标</w:t>
             </w:r>
           </w:p>
         </w:tc>
@@ -1106,14 +1111,14 @@
             </w:pPr>
             <w:r>
               <w:rPr>
-                <w:rFonts w:ascii="Arial Unicode MS" w:cs="Arial Unicode MS" w:eastAsia="Arial Unicode MS" w:hAnsi="Arial Unicode MS"/>
+                <w:rFonts w:ascii="Heiti SC" w:cs="Arial Unicode MS" w:eastAsia="Heiti SC" w:hAnsi="Heiti SC"/>
                 <w:b/>
                 <w:bCs w:val="1"/>
                 <w:color w:val="ffffff"/>
                 <w:sz w:val="17"/>
                 <w:rtl w:val="0"/>
               </w:rPr>
-              <w:t>Non-goals</w:t>
+              <w:t>非目标</w:t>
             </w:r>
           </w:p>
         </w:tc>
@@ -1149,13 +1154,13 @@
             </w:pPr>
             <w:r>
               <w:rPr>
-                <w:rFonts w:ascii="Arial Unicode MS" w:cs="Arial Unicode MS" w:eastAsia="Arial Unicode MS" w:hAnsi="Arial Unicode MS"/>
-                <w:b w:val="0"/>
-                <w:color w:val="233447"/>
-                <w:sz w:val="17"/>
-                <w:rtl w:val="0"/>
-              </w:rPr>
-              <w:t>Trace the paper question, method, parameters, Gold, and condition signature.</w:t>
+                <w:rFonts w:ascii="Heiti SC" w:cs="Arial Unicode MS" w:eastAsia="Heiti SC" w:hAnsi="Heiti SC"/>
+                <w:b w:val="0"/>
+                <w:color w:val="233447"/>
+                <w:sz w:val="17"/>
+                <w:rtl w:val="0"/>
+              </w:rPr>
+              <w:t>追踪论文问题、方法、参数、Gold和完整条件签名。</w:t>
             </w:r>
           </w:p>
         </w:tc>
@@ -1185,13 +1190,13 @@
             </w:pPr>
             <w:r>
               <w:rPr>
-                <w:rFonts w:ascii="Arial Unicode MS" w:cs="Arial Unicode MS" w:eastAsia="Arial Unicode MS" w:hAnsi="Arial Unicode MS"/>
-                <w:b w:val="0"/>
-                <w:color w:val="233447"/>
-                <w:sz w:val="17"/>
-                <w:rtl w:val="0"/>
-              </w:rPr>
-              <w:t>Do not invent unreported cutoff, mesh, timestep, model, or solver values.</w:t>
+                <w:rFonts w:ascii="Heiti SC" w:cs="Arial Unicode MS" w:eastAsia="Heiti SC" w:hAnsi="Heiti SC"/>
+                <w:b w:val="0"/>
+                <w:color w:val="233447"/>
+                <w:sz w:val="17"/>
+                <w:rtl w:val="0"/>
+              </w:rPr>
+              <w:t>不得发明论文未报告的cutoff、mesh、timestep、model或solver数值。</w:t>
             </w:r>
           </w:p>
         </w:tc>
@@ -1227,13 +1232,13 @@
             </w:pPr>
             <w:r>
               <w:rPr>
-                <w:rFonts w:ascii="Arial Unicode MS" w:cs="Arial Unicode MS" w:eastAsia="Arial Unicode MS" w:hAnsi="Arial Unicode MS"/>
-                <w:b w:val="0"/>
-                <w:color w:val="233447"/>
-                <w:sz w:val="17"/>
-                <w:rtl w:val="0"/>
-              </w:rPr>
-              <w:t>Produce enhanced tasks with 60–80% Gold and 20–40% result checks.</w:t>
+                <w:rFonts w:ascii="Heiti SC" w:cs="Arial Unicode MS" w:eastAsia="Heiti SC" w:hAnsi="Heiti SC"/>
+                <w:b w:val="0"/>
+                <w:color w:val="233447"/>
+                <w:sz w:val="17"/>
+                <w:rtl w:val="0"/>
+              </w:rPr>
+              <w:t>生成Gold占60%—80%、结果检查占20%—40%的增强题包。</w:t>
             </w:r>
           </w:p>
         </w:tc>
@@ -1263,13 +1268,13 @@
             </w:pPr>
             <w:r>
               <w:rPr>
-                <w:rFonts w:ascii="Arial Unicode MS" w:cs="Arial Unicode MS" w:eastAsia="Arial Unicode MS" w:hAnsi="Arial Unicode MS"/>
-                <w:b w:val="0"/>
-                <w:color w:val="233447"/>
-                <w:sz w:val="17"/>
-                <w:rtl w:val="0"/>
-              </w:rPr>
-              <w:t>Do not rerun DFT/MD/training or scan full large trajectories in the checker.</w:t>
+                <w:rFonts w:ascii="Heiti SC" w:cs="Arial Unicode MS" w:eastAsia="Heiti SC" w:hAnsi="Heiti SC"/>
+                <w:b w:val="0"/>
+                <w:color w:val="233447"/>
+                <w:sz w:val="17"/>
+                <w:rtl w:val="0"/>
+              </w:rPr>
+              <w:t>checker不得重跑DFT/MD/training，也不得扫描完整大体积trajectory。</w:t>
             </w:r>
           </w:p>
         </w:tc>
@@ -1305,13 +1310,13 @@
             </w:pPr>
             <w:r>
               <w:rPr>
-                <w:rFonts w:ascii="Arial Unicode MS" w:cs="Arial Unicode MS" w:eastAsia="Arial Unicode MS" w:hAnsi="Arial Unicode MS"/>
-                <w:b w:val="0"/>
-                <w:color w:val="233447"/>
-                <w:sz w:val="17"/>
-                <w:rtl w:val="0"/>
-              </w:rPr>
-              <w:t>Express resources by stable filename and identity, independent of deployment paths.</w:t>
+                <w:rFonts w:ascii="Heiti SC" w:cs="Arial Unicode MS" w:eastAsia="Heiti SC" w:hAnsi="Heiti SC"/>
+                <w:b w:val="0"/>
+                <w:color w:val="233447"/>
+                <w:sz w:val="17"/>
+                <w:rtl w:val="0"/>
+              </w:rPr>
+              <w:t>以稳定文件名和科学身份表达资源，不绑定部署路径。</w:t>
             </w:r>
           </w:p>
         </w:tc>
@@ -1341,13 +1346,13 @@
             </w:pPr>
             <w:r>
               <w:rPr>
-                <w:rFonts w:ascii="Arial Unicode MS" w:cs="Arial Unicode MS" w:eastAsia="Arial Unicode MS" w:hAnsi="Arial Unicode MS"/>
-                <w:b w:val="0"/>
-                <w:color w:val="233447"/>
-                <w:sz w:val="17"/>
-                <w:rtl w:val="0"/>
-              </w:rPr>
-              <w:t>Do not deploy resources to Bohrium/Playground or allocate Trisol IDs.</w:t>
+                <w:rFonts w:ascii="Heiti SC" w:cs="Arial Unicode MS" w:eastAsia="Heiti SC" w:hAnsi="Heiti SC"/>
+                <w:b w:val="0"/>
+                <w:color w:val="233447"/>
+                <w:sz w:val="17"/>
+                <w:rtl w:val="0"/>
+              </w:rPr>
+              <w:t>不负责向Bohrium/Playground部署资源，也不分配Trisol ID。</w:t>
             </w:r>
           </w:p>
         </w:tc>
@@ -1383,13 +1388,13 @@
             </w:pPr>
             <w:r>
               <w:rPr>
-                <w:rFonts w:ascii="Arial Unicode MS" w:cs="Arial Unicode MS" w:eastAsia="Arial Unicode MS" w:hAnsi="Arial Unicode MS"/>
-                <w:b w:val="0"/>
-                <w:color w:val="233447"/>
-                <w:sz w:val="17"/>
-                <w:rtl w:val="0"/>
-              </w:rPr>
-              <w:t>Publish only independently reviewed candidates; make failures replayable.</w:t>
+                <w:rFonts w:ascii="Heiti SC" w:cs="Arial Unicode MS" w:eastAsia="Heiti SC" w:hAnsi="Heiti SC"/>
+                <w:b w:val="0"/>
+                <w:color w:val="233447"/>
+                <w:sz w:val="17"/>
+                <w:rtl w:val="0"/>
+              </w:rPr>
+              <w:t>只发布经过独立复审的候选，并使失败可重放。</w:t>
             </w:r>
           </w:p>
         </w:tc>
@@ -1419,13 +1424,13 @@
             </w:pPr>
             <w:r>
               <w:rPr>
-                <w:rFonts w:ascii="Arial Unicode MS" w:cs="Arial Unicode MS" w:eastAsia="Arial Unicode MS" w:hAnsi="Arial Unicode MS"/>
-                <w:b w:val="0"/>
-                <w:color w:val="233447"/>
-                <w:sz w:val="17"/>
-                <w:rtl w:val="0"/>
-              </w:rPr>
-              <w:t>Do not create, inspect, run, hash, or cite solution/; do not use Repair as routine finishing.</w:t>
+                <w:rFonts w:ascii="Heiti SC" w:cs="Arial Unicode MS" w:eastAsia="Heiti SC" w:hAnsi="Heiti SC"/>
+                <w:b w:val="0"/>
+                <w:color w:val="233447"/>
+                <w:sz w:val="17"/>
+                <w:rtl w:val="0"/>
+              </w:rPr>
+              <w:t>不得创建、检查、运行、哈希或引用solution/；不得把Repair当作日常收尾流程。</w:t>
             </w:r>
           </w:p>
         </w:tc>
@@ -1455,10 +1460,10 @@
       </w:pPr>
       <w:r>
         <w:rPr>
-          <w:rFonts w:ascii="Arial Unicode MS" w:cs="Arial Unicode MS" w:eastAsia="Arial Unicode MS" w:hAnsi="Arial Unicode MS"/>
+          <w:rFonts w:ascii="Heiti SC" w:cs="Arial Unicode MS" w:eastAsia="Heiti SC" w:hAnsi="Heiti SC"/>
           <w:rtl w:val="0"/>
         </w:rPr>
-        <w:t>3.  Background and Problem Statement</w:t>
+        <w:t>3.  背景与问题</w:t>
       </w:r>
     </w:p>
     <w:p>
@@ -1471,11 +1476,11 @@
       </w:pPr>
       <w:r>
         <w:rPr>
-          <w:rFonts w:ascii="Arial Unicode MS" w:cs="Arial Unicode MS" w:eastAsia="Arial Unicode MS" w:hAnsi="Arial Unicode MS"/>
+          <w:rFonts w:ascii="Heiti SC" w:cs="Arial Unicode MS" w:eastAsia="Heiti SC" w:hAnsi="Heiti SC"/>
           <w:color w:val="233447"/>
           <w:rtl w:val="0"/>
         </w:rPr>
-        <w:t>material_v2_question contains 1,878 packages across 134 themes; the reviewed_passed comparison set contains 1,029 packages. Structural conventions are strong: ten core files are universal, nine instruction sections appear in about 98–100% of passed packages, outputs are mainly CSV/JSON, and the base image is almost uniform. However, resource methods, target policies, scoring tiers, paths, and bundle mappings have substantial historical drift.</w:t>
+        <w:t>material_v2_question包含1,878个题包，覆盖134个主题；reviewed_passed对照集包含1,029个题包。结构约定较强：10个核心文件在全部题包中出现，9个instruction章节在约98%—100%的通过题包中出现，输出主要为CSV/JSON，基础镜像也几乎统一。但资源访问方式、target policy、scoring tier、路径和bundle mapping存在明显历史漂移。</w:t>
       </w:r>
     </w:p>
     <w:p>
@@ -1489,11 +1494,11 @@
       </w:pPr>
       <w:r>
         <w:rPr>
-          <w:rFonts w:ascii="Arial Unicode MS" w:cs="Arial Unicode MS" w:eastAsia="Arial Unicode MS" w:hAnsi="Arial Unicode MS"/>
+          <w:rFonts w:ascii="Heiti SC" w:cs="Arial Unicode MS" w:eastAsia="Heiti SC" w:hAnsi="Heiti SC"/>
           <w:color w:val="233447"/>
           <w:rtl w:val="0"/>
         </w:rPr>
-        <w:t>Among 1,860 legacy final decisions, prominent hard-failure signals included 546 CHECKER_CORE_TASK_UNASSESSED cases, 142 unavailable indispensable inputs, and 100 invalid scientific targets. Current v3 Review is Baseline-first, but the distribution still argues for Q0 and asset closure before authoring, Gold freeze before checker generation, and a real low-cost result checkpoint during candidate selection.</w:t>
+        <w:t>在1,860条历史最终判定中，主要硬失败信号包括546例CHECKER_CORE_TASK_UNASSESSED、142例不可用的必要输入，以及100例无效科学目标。当前v3 Review采用Baseline-first，但这些分布仍说明：编写前必须先做Q0和资产闭环，生成checker前必须冻结Gold，选择候选时还要确认至少存在一个真实、低成本的结果检查点。</w:t>
       </w:r>
     </w:p>
     <w:p>
@@ -1506,10 +1511,10 @@
       </w:pPr>
       <w:r>
         <w:rPr>
-          <w:rFonts w:ascii="Arial Unicode MS" w:cs="Arial Unicode MS" w:eastAsia="Arial Unicode MS" w:hAnsi="Arial Unicode MS"/>
+          <w:rFonts w:ascii="Heiti SC" w:cs="Arial Unicode MS" w:eastAsia="Heiti SC" w:hAnsi="Heiti SC"/>
           <w:rtl w:val="0"/>
         </w:rPr>
-        <w:t>4.  Proposed Architecture</w:t>
+        <w:t>4.  系统架构</w:t>
       </w:r>
     </w:p>
     <w:p>
@@ -1522,10 +1527,10 @@
       </w:pPr>
       <w:r>
         <w:rPr>
-          <w:rFonts w:ascii="Arial Unicode MS" w:hAnsi="Arial Unicode MS" w:eastAsia="Arial Unicode MS" w:cs="Arial Unicode MS"/>
+          <w:rFonts w:ascii="Heiti SC" w:hAnsi="Heiti SC" w:eastAsia="Heiti SC" w:cs="Arial Unicode MS"/>
           <w:rtl w:val="0"/>
         </w:rPr>
-        <w:t>The pipeline separates scientific evidence, candidate selection, package compilation, and independent acceptance.</w:t>
+        <w:t>流程把科学证据、候选选择、题包编译和独立验收分成四个可追踪层次。</w:t>
       </w:r>
     </w:p>
     <w:p>
@@ -1594,12 +1599,12 @@
       </w:pPr>
       <w:r>
         <w:rPr>
-          <w:rFonts w:ascii="Arial Unicode MS" w:cs="Arial Unicode MS" w:eastAsia="Arial Unicode MS" w:hAnsi="Arial Unicode MS"/>
+          <w:rFonts w:ascii="Heiti SC" w:cs="Arial Unicode MS" w:eastAsia="Heiti SC" w:hAnsi="Heiti SC"/>
           <w:color w:val="5A6470"/>
           <w:sz w:val="17"/>
           <w:rtl w:val="0"/>
         </w:rPr>
-        <w:t>Figure 1. Evidence-backed Authoring compilation pipeline. Red is a fail-closed authoring exit; green accepts only independently reviewed enhanced candidates.</w:t>
+        <w:t>图1. 有证据约束的Authoring编译流程。红色表示封闭失败出口，绿色表示仅发布通过独立复审的增强型候选；框内路径、状态枚举和工具名保留英文，以便直接对应实现。</w:t>
       </w:r>
     </w:p>
     <w:p>
@@ -1640,10 +1645,10 @@
       <w:bookmarkEnd w:id="3"/>
       <w:r>
         <w:rPr>
-          <w:rFonts w:ascii="Arial Unicode MS" w:hAnsi="Arial Unicode MS" w:eastAsia="Arial Unicode MS" w:cs="Arial Unicode MS"/>
+          <w:rFonts w:ascii="Heiti SC" w:hAnsi="Heiti SC" w:eastAsia="Heiti SC" w:cs="Arial Unicode MS"/>
           <w:rtl w:val="0"/>
         </w:rPr>
-        <w:t>Core components</w:t>
+        <w:t>核心组件</w:t>
       </w:r>
     </w:p>
     <w:p>
@@ -1722,14 +1727,14 @@
             </w:pPr>
             <w:r>
               <w:rPr>
-                <w:rFonts w:ascii="Arial Unicode MS" w:cs="Arial Unicode MS" w:eastAsia="Arial Unicode MS" w:hAnsi="Arial Unicode MS"/>
+                <w:rFonts w:ascii="Heiti SC" w:cs="Arial Unicode MS" w:eastAsia="Heiti SC" w:hAnsi="Heiti SC"/>
                 <w:b/>
                 <w:bCs w:val="1"/>
                 <w:color w:val="ffffff"/>
                 <w:sz w:val="17"/>
                 <w:rtl w:val="0"/>
               </w:rPr>
-              <w:t>Component</w:t>
+              <w:t>组件</w:t>
             </w:r>
           </w:p>
         </w:tc>
@@ -1759,14 +1764,14 @@
             </w:pPr>
             <w:r>
               <w:rPr>
-                <w:rFonts w:ascii="Arial Unicode MS" w:cs="Arial Unicode MS" w:eastAsia="Arial Unicode MS" w:hAnsi="Arial Unicode MS"/>
+                <w:rFonts w:ascii="Heiti SC" w:cs="Arial Unicode MS" w:eastAsia="Heiti SC" w:hAnsi="Heiti SC"/>
                 <w:b/>
                 <w:bCs w:val="1"/>
                 <w:color w:val="ffffff"/>
                 <w:sz w:val="17"/>
                 <w:rtl w:val="0"/>
               </w:rPr>
-              <w:t>Responsibility</w:t>
+              <w:t>职责</w:t>
             </w:r>
           </w:p>
         </w:tc>
@@ -1796,14 +1801,14 @@
             </w:pPr>
             <w:r>
               <w:rPr>
-                <w:rFonts w:ascii="Arial Unicode MS" w:cs="Arial Unicode MS" w:eastAsia="Arial Unicode MS" w:hAnsi="Arial Unicode MS"/>
+                <w:rFonts w:ascii="Heiti SC" w:cs="Arial Unicode MS" w:eastAsia="Heiti SC" w:hAnsi="Heiti SC"/>
                 <w:b/>
                 <w:bCs w:val="1"/>
                 <w:color w:val="ffffff"/>
                 <w:sz w:val="17"/>
                 <w:rtl w:val="0"/>
               </w:rPr>
-              <w:t>Primary storage</w:t>
+              <w:t>主要存储</w:t>
             </w:r>
           </w:p>
         </w:tc>
@@ -1833,14 +1838,14 @@
             </w:pPr>
             <w:r>
               <w:rPr>
-                <w:rFonts w:ascii="Arial Unicode MS" w:cs="Arial Unicode MS" w:eastAsia="Arial Unicode MS" w:hAnsi="Arial Unicode MS"/>
+                <w:rFonts w:ascii="Heiti SC" w:cs="Arial Unicode MS" w:eastAsia="Heiti SC" w:hAnsi="Heiti SC"/>
                 <w:b/>
                 <w:bCs w:val="1"/>
                 <w:color w:val="ffffff"/>
                 <w:sz w:val="17"/>
                 <w:rtl w:val="0"/>
               </w:rPr>
-              <w:t>Failure behavior</w:t>
+              <w:t>失败行为</w:t>
             </w:r>
           </w:p>
         </w:tc>
@@ -1876,13 +1881,13 @@
             </w:pPr>
             <w:r>
               <w:rPr>
-                <w:rFonts w:ascii="Arial Unicode MS" w:cs="Arial Unicode MS" w:eastAsia="Arial Unicode MS" w:hAnsi="Arial Unicode MS"/>
-                <w:b w:val="0"/>
-                <w:color w:val="233447"/>
-                <w:sz w:val="17"/>
-                <w:rtl w:val="0"/>
-              </w:rPr>
-              <w:t>Source Freezer + UniParser Adapter</w:t>
+                <w:rFonts w:ascii="Heiti SC" w:cs="Arial Unicode MS" w:eastAsia="Heiti SC" w:hAnsi="Heiti SC"/>
+                <w:b w:val="0"/>
+                <w:color w:val="233447"/>
+                <w:sz w:val="17"/>
+                <w:rtl w:val="0"/>
+              </w:rPr>
+              <w:t>源文件冻结器＋UniParser适配器</w:t>
             </w:r>
           </w:p>
         </w:tc>
@@ -1912,13 +1917,13 @@
             </w:pPr>
             <w:r>
               <w:rPr>
-                <w:rFonts w:ascii="Arial Unicode MS" w:cs="Arial Unicode MS" w:eastAsia="Arial Unicode MS" w:hAnsi="Arial Unicode MS"/>
-                <w:b w:val="0"/>
-                <w:color w:val="233447"/>
-                <w:sz w:val="17"/>
-                <w:rtl w:val="0"/>
-              </w:rPr>
-              <w:t>Freeze PDF hash; choose digital/OCR flags; create paper.md; record token and parse quality.</w:t>
+                <w:rFonts w:ascii="Heiti SC" w:cs="Arial Unicode MS" w:eastAsia="Heiti SC" w:hAnsi="Heiti SC"/>
+                <w:b w:val="0"/>
+                <w:color w:val="233447"/>
+                <w:sz w:val="17"/>
+                <w:rtl w:val="0"/>
+              </w:rPr>
+              <w:t>冻结PDF哈希；选择数字文本/OCR参数；生成paper.md；记录token和解析质量。</w:t>
             </w:r>
           </w:p>
         </w:tc>
@@ -1948,13 +1953,13 @@
             </w:pPr>
             <w:r>
               <w:rPr>
-                <w:rFonts w:ascii="Arial Unicode MS" w:cs="Arial Unicode MS" w:eastAsia="Arial Unicode MS" w:hAnsi="Arial Unicode MS"/>
-                <w:b w:val="0"/>
-                <w:color w:val="233447"/>
-                <w:sz w:val="17"/>
-                <w:rtl w:val="0"/>
-              </w:rPr>
-              <w:t>processing/source + authoring_record.json</w:t>
+                <w:rFonts w:ascii="Heiti SC" w:cs="Arial Unicode MS" w:eastAsia="Heiti SC" w:hAnsi="Heiti SC"/>
+                <w:b w:val="0"/>
+                <w:color w:val="233447"/>
+                <w:sz w:val="17"/>
+                <w:rtl w:val="0"/>
+              </w:rPr>
+              <w:t>processing/source＋authoring_record.json</w:t>
             </w:r>
           </w:p>
         </w:tc>
@@ -1984,13 +1989,13 @@
             </w:pPr>
             <w:r>
               <w:rPr>
-                <w:rFonts w:ascii="Arial Unicode MS" w:cs="Arial Unicode MS" w:eastAsia="Arial Unicode MS" w:hAnsi="Arial Unicode MS"/>
-                <w:b w:val="0"/>
-                <w:color w:val="233447"/>
-                <w:sz w:val="17"/>
-                <w:rtl w:val="0"/>
-              </w:rPr>
-              <w:t>BLOCKED_SOURCE_PARSE if load-bearing equations, tables, or captions are missing.</w:t>
+                <w:rFonts w:ascii="Heiti SC" w:cs="Arial Unicode MS" w:eastAsia="Heiti SC" w:hAnsi="Heiti SC"/>
+                <w:b w:val="0"/>
+                <w:color w:val="233447"/>
+                <w:sz w:val="17"/>
+                <w:rtl w:val="0"/>
+              </w:rPr>
+              <w:t>关键公式、表格或图注缺失时标记BLOCKED_SOURCE_PARSE。</w:t>
             </w:r>
           </w:p>
         </w:tc>
@@ -2026,13 +2031,13 @@
             </w:pPr>
             <w:r>
               <w:rPr>
-                <w:rFonts w:ascii="Arial Unicode MS" w:cs="Arial Unicode MS" w:eastAsia="Arial Unicode MS" w:hAnsi="Arial Unicode MS"/>
-                <w:b w:val="0"/>
-                <w:color w:val="233447"/>
-                <w:sz w:val="17"/>
-                <w:rtl w:val="0"/>
-              </w:rPr>
-              <w:t>Evidence Mapper</w:t>
+                <w:rFonts w:ascii="Heiti SC" w:cs="Arial Unicode MS" w:eastAsia="Heiti SC" w:hAnsi="Heiti SC"/>
+                <w:b w:val="0"/>
+                <w:color w:val="233447"/>
+                <w:sz w:val="17"/>
+                <w:rtl w:val="0"/>
+              </w:rPr>
+              <w:t>证据映射器</w:t>
             </w:r>
           </w:p>
         </w:tc>
@@ -2062,13 +2067,13 @@
             </w:pPr>
             <w:r>
               <w:rPr>
-                <w:rFonts w:ascii="Arial Unicode MS" w:cs="Arial Unicode MS" w:eastAsia="Arial Unicode MS" w:hAnsi="Arial Unicode MS"/>
-                <w:b w:val="0"/>
-                <w:color w:val="233447"/>
-                <w:sz w:val="17"/>
-                <w:rtl w:val="0"/>
-              </w:rPr>
-              <w:t>Extract system, method, four parameter classes, condition groups, Gold candidates, resources, and workflow edges.</w:t>
+                <w:rFonts w:ascii="Heiti SC" w:cs="Arial Unicode MS" w:eastAsia="Heiti SC" w:hAnsi="Heiti SC"/>
+                <w:b w:val="0"/>
+                <w:color w:val="233447"/>
+                <w:sz w:val="17"/>
+                <w:rtl w:val="0"/>
+              </w:rPr>
+              <w:t>提取体系、方法、四类参数、条件组、Gold候选、资源和Workflow边。</w:t>
             </w:r>
           </w:p>
         </w:tc>
@@ -2098,13 +2103,13 @@
             </w:pPr>
             <w:r>
               <w:rPr>
-                <w:rFonts w:ascii="Arial Unicode MS" w:cs="Arial Unicode MS" w:eastAsia="Arial Unicode MS" w:hAnsi="Arial Unicode MS"/>
-                <w:b w:val="0"/>
-                <w:color w:val="233447"/>
-                <w:sz w:val="17"/>
-                <w:rtl w:val="0"/>
-              </w:rPr>
-              <w:t>external authoring_record.json</w:t>
+                <w:rFonts w:ascii="Heiti SC" w:cs="Arial Unicode MS" w:eastAsia="Heiti SC" w:hAnsi="Heiti SC"/>
+                <w:b w:val="0"/>
+                <w:color w:val="233447"/>
+                <w:sz w:val="17"/>
+                <w:rtl w:val="0"/>
+              </w:rPr>
+              <w:t>题包外authoring_record.json</w:t>
             </w:r>
           </w:p>
         </w:tc>
@@ -2134,13 +2139,13 @@
             </w:pPr>
             <w:r>
               <w:rPr>
-                <w:rFonts w:ascii="Arial Unicode MS" w:cs="Arial Unicode MS" w:eastAsia="Arial Unicode MS" w:hAnsi="Arial Unicode MS"/>
-                <w:b w:val="0"/>
-                <w:color w:val="233447"/>
-                <w:sz w:val="17"/>
-                <w:rtl w:val="0"/>
-              </w:rPr>
-              <w:t>Do not enter candidate selection while a core claim lacks a locator.</w:t>
+                <w:rFonts w:ascii="Heiti SC" w:cs="Arial Unicode MS" w:eastAsia="Heiti SC" w:hAnsi="Heiti SC"/>
+                <w:b w:val="0"/>
+                <w:color w:val="233447"/>
+                <w:sz w:val="17"/>
+                <w:rtl w:val="0"/>
+              </w:rPr>
+              <w:t>核心主张缺少locator时不得进入候选选择。</w:t>
             </w:r>
           </w:p>
         </w:tc>
@@ -2176,13 +2181,13 @@
             </w:pPr>
             <w:r>
               <w:rPr>
-                <w:rFonts w:ascii="Arial Unicode MS" w:cs="Arial Unicode MS" w:eastAsia="Arial Unicode MS" w:hAnsi="Arial Unicode MS"/>
-                <w:b w:val="0"/>
-                <w:color w:val="233447"/>
-                <w:sz w:val="17"/>
-                <w:rtl w:val="0"/>
-              </w:rPr>
-              <w:t>Candidate Gate &amp; Selector</w:t>
+                <w:rFonts w:ascii="Heiti SC" w:cs="Arial Unicode MS" w:eastAsia="Heiti SC" w:hAnsi="Heiti SC"/>
+                <w:b w:val="0"/>
+                <w:color w:val="233447"/>
+                <w:sz w:val="17"/>
+                <w:rtl w:val="0"/>
+              </w:rPr>
+              <w:t>候选门禁与选择器</w:t>
             </w:r>
           </w:p>
         </w:tc>
@@ -2212,13 +2217,13 @@
             </w:pPr>
             <w:r>
               <w:rPr>
-                <w:rFonts w:ascii="Arial Unicode MS" w:cs="Arial Unicode MS" w:eastAsia="Arial Unicode MS" w:hAnsi="Arial Unicode MS"/>
-                <w:b w:val="0"/>
-                <w:color w:val="233447"/>
-                <w:sz w:val="17"/>
-                <w:rtl w:val="0"/>
-              </w:rPr>
-              <w:t>Enumerate at least three candidates when possible; gate lexicographically on Q0, Gold, resources, workflow, and checkpoint.</w:t>
+                <w:rFonts w:ascii="Heiti SC" w:cs="Arial Unicode MS" w:eastAsia="Heiti SC" w:hAnsi="Heiti SC"/>
+                <w:b w:val="0"/>
+                <w:color w:val="233447"/>
+                <w:sz w:val="17"/>
+                <w:rtl w:val="0"/>
+              </w:rPr>
+              <w:t>论文允许时枚举至少3个候选；依次按Q0、Gold、资源、Workflow和checkpoint门禁。</w:t>
             </w:r>
           </w:p>
         </w:tc>
@@ -2248,7 +2253,7 @@
             </w:pPr>
             <w:r>
               <w:rPr>
-                <w:rFonts w:ascii="Arial Unicode MS" w:cs="Arial Unicode MS" w:eastAsia="Arial Unicode MS" w:hAnsi="Arial Unicode MS"/>
+                <w:rFonts w:ascii="Heiti SC" w:cs="Arial Unicode MS" w:eastAsia="Heiti SC" w:hAnsi="Heiti SC"/>
                 <w:b w:val="0"/>
                 <w:color w:val="233447"/>
                 <w:sz w:val="17"/>
@@ -2284,13 +2289,13 @@
             </w:pPr>
             <w:r>
               <w:rPr>
-                <w:rFonts w:ascii="Arial Unicode MS" w:cs="Arial Unicode MS" w:eastAsia="Arial Unicode MS" w:hAnsi="Arial Unicode MS"/>
-                <w:b w:val="0"/>
-                <w:color w:val="233447"/>
-                <w:sz w:val="17"/>
-                <w:rtl w:val="0"/>
-              </w:rPr>
-              <w:t>NO_ENHANCED_CANDIDATE if all fail; emit no weak package.</w:t>
+                <w:rFonts w:ascii="Heiti SC" w:cs="Arial Unicode MS" w:eastAsia="Heiti SC" w:hAnsi="Heiti SC"/>
+                <w:b w:val="0"/>
+                <w:color w:val="233447"/>
+                <w:sz w:val="17"/>
+                <w:rtl w:val="0"/>
+              </w:rPr>
+              <w:t>全部失败时返回NO_ENHANCED_CANDIDATE，不输出弱题包。</w:t>
             </w:r>
           </w:p>
         </w:tc>
@@ -2326,13 +2331,13 @@
             </w:pPr>
             <w:r>
               <w:rPr>
-                <w:rFonts w:ascii="Arial Unicode MS" w:cs="Arial Unicode MS" w:eastAsia="Arial Unicode MS" w:hAnsi="Arial Unicode MS"/>
-                <w:b w:val="0"/>
-                <w:color w:val="233447"/>
-                <w:sz w:val="17"/>
-                <w:rtl w:val="0"/>
-              </w:rPr>
-              <w:t>Package + Gold/Checker Compiler</w:t>
+                <w:rFonts w:ascii="Heiti SC" w:cs="Arial Unicode MS" w:eastAsia="Heiti SC" w:hAnsi="Heiti SC"/>
+                <w:b w:val="0"/>
+                <w:color w:val="233447"/>
+                <w:sz w:val="17"/>
+                <w:rtl w:val="0"/>
+              </w:rPr>
+              <w:t>题包＋Gold/Checker编译器</w:t>
             </w:r>
           </w:p>
         </w:tc>
@@ -2362,13 +2367,13 @@
             </w:pPr>
             <w:r>
               <w:rPr>
-                <w:rFonts w:ascii="Arial Unicode MS" w:cs="Arial Unicode MS" w:eastAsia="Arial Unicode MS" w:hAnsi="Arial Unicode MS"/>
-                <w:b w:val="0"/>
-                <w:color w:val="233447"/>
-                <w:sz w:val="17"/>
-                <w:rtl w:val="0"/>
-              </w:rPr>
-              <w:t>Write instruction first, synchronize JSON/TOML/tests, and freeze Gold, tolerance, weights, and hidden references.</w:t>
+                <w:rFonts w:ascii="Heiti SC" w:cs="Arial Unicode MS" w:eastAsia="Heiti SC" w:hAnsi="Heiti SC"/>
+                <w:b w:val="0"/>
+                <w:color w:val="233447"/>
+                <w:sz w:val="17"/>
+                <w:rtl w:val="0"/>
+              </w:rPr>
+              <w:t>先写instruction，同步JSON/TOML/tests，再冻结Gold、容差、权重和隐藏reference。</w:t>
             </w:r>
           </w:p>
         </w:tc>
@@ -2398,13 +2403,13 @@
             </w:pPr>
             <w:r>
               <w:rPr>
-                <w:rFonts w:ascii="Arial Unicode MS" w:cs="Arial Unicode MS" w:eastAsia="Arial Unicode MS" w:hAnsi="Arial Unicode MS"/>
-                <w:b w:val="0"/>
-                <w:color w:val="233447"/>
-                <w:sz w:val="17"/>
-                <w:rtl w:val="0"/>
-              </w:rPr>
-              <w:t>processing/candidate + evidence</w:t>
+                <w:rFonts w:ascii="Heiti SC" w:cs="Arial Unicode MS" w:eastAsia="Heiti SC" w:hAnsi="Heiti SC"/>
+                <w:b w:val="0"/>
+                <w:color w:val="233447"/>
+                <w:sz w:val="17"/>
+                <w:rtl w:val="0"/>
+              </w:rPr>
+              <w:t>processing/candidate＋evidence</w:t>
             </w:r>
           </w:p>
         </w:tc>
@@ -2434,13 +2439,13 @@
             </w:pPr>
             <w:r>
               <w:rPr>
-                <w:rFonts w:ascii="Arial Unicode MS" w:cs="Arial Unicode MS" w:eastAsia="Arial Unicode MS" w:hAnsi="Arial Unicode MS"/>
-                <w:b w:val="0"/>
-                <w:color w:val="233447"/>
-                <w:sz w:val="17"/>
-                <w:rtl w:val="0"/>
-              </w:rPr>
-              <w:t>Return to evidence mapping on condition mismatch, path coupling, or guessed values.</w:t>
+                <w:rFonts w:ascii="Heiti SC" w:cs="Arial Unicode MS" w:eastAsia="Heiti SC" w:hAnsi="Heiti SC"/>
+                <w:b w:val="0"/>
+                <w:color w:val="233447"/>
+                <w:sz w:val="17"/>
+                <w:rtl w:val="0"/>
+              </w:rPr>
+              <w:t>条件错配、路径耦合或猜补数值时返回证据映射层。</w:t>
             </w:r>
           </w:p>
         </w:tc>
@@ -2477,13 +2482,13 @@
             </w:pPr>
             <w:r>
               <w:rPr>
-                <w:rFonts w:ascii="Arial Unicode MS" w:cs="Arial Unicode MS" w:eastAsia="Arial Unicode MS" w:hAnsi="Arial Unicode MS"/>
-                <w:b w:val="0"/>
-                <w:color w:val="233447"/>
-                <w:sz w:val="17"/>
-                <w:rtl w:val="0"/>
-              </w:rPr>
-              <w:t>Validators + Independent Review Bridge</w:t>
+                <w:rFonts w:ascii="Heiti SC" w:cs="Arial Unicode MS" w:eastAsia="Heiti SC" w:hAnsi="Heiti SC"/>
+                <w:b w:val="0"/>
+                <w:color w:val="233447"/>
+                <w:sz w:val="17"/>
+                <w:rtl w:val="0"/>
+              </w:rPr>
+              <w:t>校验器＋独立Review桥接器</w:t>
             </w:r>
           </w:p>
         </w:tc>
@@ -2513,13 +2518,13 @@
             </w:pPr>
             <w:r>
               <w:rPr>
-                <w:rFonts w:ascii="Arial Unicode MS" w:cs="Arial Unicode MS" w:eastAsia="Arial Unicode MS" w:hAnsi="Arial Unicode MS"/>
-                <w:b w:val="0"/>
-                <w:color w:val="233447"/>
-                <w:sz w:val="17"/>
-                <w:rtl w:val="0"/>
-              </w:rPr>
-              <w:t>Run schema, probe, and cost gates; use independent Review to decide publishability.</w:t>
+                <w:rFonts w:ascii="Heiti SC" w:cs="Arial Unicode MS" w:eastAsia="Heiti SC" w:hAnsi="Heiti SC"/>
+                <w:b w:val="0"/>
+                <w:color w:val="233447"/>
+                <w:sz w:val="17"/>
+                <w:rtl w:val="0"/>
+              </w:rPr>
+              <w:t>运行schema、probe和cost门禁；由独立Review决定可发布性。</w:t>
             </w:r>
           </w:p>
         </w:tc>
@@ -2549,13 +2554,13 @@
             </w:pPr>
             <w:r>
               <w:rPr>
-                <w:rFonts w:ascii="Arial Unicode MS" w:cs="Arial Unicode MS" w:eastAsia="Arial Unicode MS" w:hAnsi="Arial Unicode MS"/>
-                <w:b w:val="0"/>
-                <w:color w:val="233447"/>
-                <w:sz w:val="17"/>
-                <w:rtl w:val="0"/>
-              </w:rPr>
-              <w:t>validation logs + independent_review</w:t>
+                <w:rFonts w:ascii="Heiti SC" w:cs="Arial Unicode MS" w:eastAsia="Heiti SC" w:hAnsi="Heiti SC"/>
+                <w:b w:val="0"/>
+                <w:color w:val="233447"/>
+                <w:sz w:val="17"/>
+                <w:rtl w:val="0"/>
+              </w:rPr>
+              <w:t>validation logs＋independent_review</w:t>
             </w:r>
           </w:p>
         </w:tc>
@@ -2585,13 +2590,13 @@
             </w:pPr>
             <w:r>
               <w:rPr>
-                <w:rFonts w:ascii="Arial Unicode MS" w:cs="Arial Unicode MS" w:eastAsia="Arial Unicode MS" w:hAnsi="Arial Unicode MS"/>
-                <w:b w:val="0"/>
-                <w:color w:val="233447"/>
-                <w:sz w:val="17"/>
-                <w:rtl w:val="0"/>
-              </w:rPr>
-              <w:t>Local pass is not scientific approval; Review failure returns to Authoring.</w:t>
+                <w:rFonts w:ascii="Heiti SC" w:cs="Arial Unicode MS" w:eastAsia="Heiti SC" w:hAnsi="Heiti SC"/>
+                <w:b w:val="0"/>
+                <w:color w:val="233447"/>
+                <w:sz w:val="17"/>
+                <w:rtl w:val="0"/>
+              </w:rPr>
+              <w:t>本地通过不等于科学批准；Review失败返回Authoring。</w:t>
             </w:r>
           </w:p>
         </w:tc>
@@ -2636,10 +2641,10 @@
       </w:pPr>
       <w:r>
         <w:rPr>
-          <w:rFonts w:ascii="Arial Unicode MS" w:cs="Arial Unicode MS" w:eastAsia="Arial Unicode MS" w:hAnsi="Arial Unicode MS"/>
+          <w:rFonts w:ascii="Heiti SC" w:cs="Arial Unicode MS" w:eastAsia="Heiti SC" w:hAnsi="Heiti SC"/>
           <w:rtl w:val="0"/>
         </w:rPr>
-        <w:t>5.  Request Lifecycle</w:t>
+        <w:t>5.  请求生命周期</w:t>
       </w:r>
     </w:p>
     <w:p>
@@ -2665,7 +2670,7 @@
       </w:pPr>
       <w:r>
         <w:rPr>
-          <w:rFonts w:ascii="Arial Unicode MS" w:cs="Arial Unicode MS" w:eastAsia="Arial Unicode MS" w:hAnsi="Arial Unicode MS"/>
+          <w:rFonts w:ascii="Heiti SC" w:cs="Arial Unicode MS" w:eastAsia="Heiti SC" w:hAnsi="Heiti SC"/>
           <w:i w:val="0"/>
           <w:iCs w:val="0"/>
           <w:smallCaps w:val="0"/>
@@ -2678,7 +2683,7 @@
           <w:vertAlign w:val="baseline"/>
           <w:rtl w:val="0"/>
         </w:rPr>
-        <w:t>1. Accept the PDF, stable paper_id, task name, and optional resources; create an external processing workspace.</w:t>
+        <w:t>1. 接收论文PDF、稳定的paper_id、task name和可选资源，创建题包外的处理工作区。</w:t>
       </w:r>
     </w:p>
     <w:p>
@@ -2704,7 +2709,7 @@
       </w:pPr>
       <w:r>
         <w:rPr>
-          <w:rFonts w:ascii="Arial Unicode MS" w:cs="Arial Unicode MS" w:eastAsia="Arial Unicode MS" w:hAnsi="Arial Unicode MS"/>
+          <w:rFonts w:ascii="Heiti SC" w:cs="Arial Unicode MS" w:eastAsia="Heiti SC" w:hAnsi="Heiti SC"/>
           <w:i w:val="0"/>
           <w:iCs w:val="0"/>
           <w:smallCaps w:val="0"/>
@@ -2717,7 +2722,7 @@
           <w:vertAlign w:val="baseline"/>
           <w:rtl w:val="0"/>
         </w:rPr>
-        <w:t>2. Compute PDF SHA-256; use UniParser digital or OCR mode; inspect equations, tables, captions, and units.</w:t>
+        <w:t>2. 计算PDF SHA-256；按文档类型选择UniParser数字文本或OCR模式；检查公式、表格、图注和单位。</w:t>
       </w:r>
     </w:p>
     <w:p>
@@ -2743,7 +2748,7 @@
       </w:pPr>
       <w:r>
         <w:rPr>
-          <w:rFonts w:ascii="Arial Unicode MS" w:cs="Arial Unicode MS" w:eastAsia="Arial Unicode MS" w:hAnsi="Arial Unicode MS"/>
+          <w:rFonts w:ascii="Heiti SC" w:cs="Arial Unicode MS" w:eastAsia="Heiti SC" w:hAnsi="Heiti SC"/>
           <w:i w:val="0"/>
           <w:iCs w:val="0"/>
           <w:smallCaps w:val="0"/>
@@ -2756,7 +2761,7 @@
           <w:vertAlign w:val="baseline"/>
           <w:rtl w:val="0"/>
         </w:rPr>
-        <w:t>3. Build the paper evidence map; classify parameters as PAPER_FIXED, SOLVER_SEARCHABLE, TARGET_DEFINING, or INDISPENSABLE_ASSET.</w:t>
+        <w:t>3. 建立论文证据图谱；把参数分类为PAPER_FIXED、SOLVER_SEARCHABLE、TARGET_DEFINING或INDISPENSABLE_ASSET。</w:t>
       </w:r>
     </w:p>
     <w:p>
@@ -2782,7 +2787,7 @@
       </w:pPr>
       <w:r>
         <w:rPr>
-          <w:rFonts w:ascii="Arial Unicode MS" w:cs="Arial Unicode MS" w:eastAsia="Arial Unicode MS" w:hAnsi="Arial Unicode MS"/>
+          <w:rFonts w:ascii="Heiti SC" w:cs="Arial Unicode MS" w:eastAsia="Heiti SC" w:hAnsi="Heiti SC"/>
           <w:i w:val="0"/>
           <w:iCs w:val="0"/>
           <w:smallCaps w:val="0"/>
@@ -2795,7 +2800,7 @@
           <w:vertAlign w:val="baseline"/>
           <w:rtl w:val="0"/>
         </w:rPr>
-        <w:t>4. Enumerate candidates and run Q0 first; bind each to condition groups, Gold, resources, workflow, and checkpoint.</w:t>
+        <w:t>4. 枚举候选并首先执行Q0；把每个候选绑定到条件组、Gold、资源、Workflow和checkpoint。</w:t>
       </w:r>
     </w:p>
     <w:p>
@@ -2821,7 +2826,7 @@
       </w:pPr>
       <w:r>
         <w:rPr>
-          <w:rFonts w:ascii="Arial Unicode MS" w:cs="Arial Unicode MS" w:eastAsia="Arial Unicode MS" w:hAnsi="Arial Unicode MS"/>
+          <w:rFonts w:ascii="Heiti SC" w:cs="Arial Unicode MS" w:eastAsia="Heiti SC" w:hAnsi="Heiti SC"/>
           <w:i w:val="0"/>
           <w:iCs w:val="0"/>
           <w:smallCaps w:val="0"/>
@@ -2834,7 +2839,7 @@
           <w:vertAlign w:val="baseline"/>
           <w:rtl w:val="0"/>
         </w:rPr>
-        <w:t>5. Select only an enhanced-feasible candidate; write a self-contained instruction, then derive steps/manifest/resources/task.</w:t>
+        <w:t>5. 只选择具备增强可行性的候选；先写自包含instruction，再派生steps/manifest/resources/task。</w:t>
       </w:r>
     </w:p>
     <w:p>
@@ -2860,7 +2865,7 @@
       </w:pPr>
       <w:r>
         <w:rPr>
-          <w:rFonts w:ascii="Arial Unicode MS" w:cs="Arial Unicode MS" w:eastAsia="Arial Unicode MS" w:hAnsi="Arial Unicode MS"/>
+          <w:rFonts w:ascii="Heiti SC" w:cs="Arial Unicode MS" w:eastAsia="Heiti SC" w:hAnsi="Heiti SC"/>
           <w:i w:val="0"/>
           <w:iCs w:val="0"/>
           <w:smallCaps w:val="0"/>
@@ -2873,7 +2878,7 @@
           <w:vertAlign w:val="baseline"/>
           <w:rtl w:val="0"/>
         </w:rPr>
-        <w:t>6. Freeze Gold and tolerance; generate a 60–80% Gold plus 20–40% result-check checker; run Baseline, risk-matched, and real-scale cost probes.</w:t>
+        <w:t>6. 冻结Gold与容差；生成Gold占60%—80%、结果检查占20%—40%的checker；运行Baseline、风险匹配和真实规模成本探针。</w:t>
       </w:r>
     </w:p>
     <w:p>
@@ -2899,7 +2904,7 @@
       </w:pPr>
       <w:r>
         <w:rPr>
-          <w:rFonts w:ascii="Arial Unicode MS" w:cs="Arial Unicode MS" w:eastAsia="Arial Unicode MS" w:hAnsi="Arial Unicode MS"/>
+          <w:rFonts w:ascii="Heiti SC" w:cs="Arial Unicode MS" w:eastAsia="Heiti SC" w:hAnsi="Heiti SC"/>
           <w:i w:val="0"/>
           <w:iCs w:val="0"/>
           <w:smallCaps w:val="0"/>
@@ -2912,7 +2917,7 @@
           <w:vertAlign w:val="baseline"/>
           <w:rtl w:val="0"/>
         </w:rPr>
-        <w:t>7. Run authoring/package/Harbor static validation and independent Review; publish only PASS + RESULT_ENHANCED.</w:t>
+        <w:t>7. 运行Authoring、package和Harbor静态校验及独立Review；仅发布PASS＋RESULT_ENHANCED。</w:t>
       </w:r>
     </w:p>
     <w:p>
@@ -2939,10 +2944,10 @@
       </w:pPr>
       <w:r>
         <w:rPr>
-          <w:rFonts w:ascii="Arial Unicode MS" w:cs="Arial Unicode MS" w:eastAsia="Arial Unicode MS" w:hAnsi="Arial Unicode MS"/>
+          <w:rFonts w:ascii="Heiti SC" w:cs="Arial Unicode MS" w:eastAsia="Heiti SC" w:hAnsi="Heiti SC"/>
           <w:rtl w:val="0"/>
         </w:rPr>
-        <w:t>6.  API and Data Contracts</w:t>
+        <w:t>6.  API与数据合同</w:t>
       </w:r>
     </w:p>
     <w:p>
@@ -2955,10 +2960,10 @@
       <w:bookmarkEnd w:id="4"/>
       <w:r>
         <w:rPr>
-          <w:rFonts w:ascii="Arial Unicode MS" w:hAnsi="Arial Unicode MS" w:eastAsia="Arial Unicode MS" w:cs="Arial Unicode MS"/>
+          <w:rFonts w:ascii="Heiti SC" w:hAnsi="Heiti SC" w:eastAsia="Heiti SC" w:cs="Arial Unicode MS"/>
           <w:rtl w:val="0"/>
         </w:rPr>
-        <w:t>Primary data contract: authoring_record.json</w:t>
+        <w:t>主数据合同：authoring_record.json</w:t>
       </w:r>
     </w:p>
     <w:p>
@@ -3037,14 +3042,14 @@
             </w:pPr>
             <w:r>
               <w:rPr>
-                <w:rFonts w:ascii="Arial Unicode MS" w:cs="Arial Unicode MS" w:eastAsia="Arial Unicode MS" w:hAnsi="Arial Unicode MS"/>
+                <w:rFonts w:ascii="Heiti SC" w:cs="Arial Unicode MS" w:eastAsia="Heiti SC" w:hAnsi="Heiti SC"/>
                 <w:b/>
                 <w:bCs w:val="1"/>
                 <w:color w:val="ffffff"/>
                 <w:sz w:val="17"/>
                 <w:rtl w:val="0"/>
               </w:rPr>
-              <w:t>Field</w:t>
+              <w:t>字段</w:t>
             </w:r>
           </w:p>
         </w:tc>
@@ -3074,14 +3079,14 @@
             </w:pPr>
             <w:r>
               <w:rPr>
-                <w:rFonts w:ascii="Arial Unicode MS" w:cs="Arial Unicode MS" w:eastAsia="Arial Unicode MS" w:hAnsi="Arial Unicode MS"/>
+                <w:rFonts w:ascii="Heiti SC" w:cs="Arial Unicode MS" w:eastAsia="Heiti SC" w:hAnsi="Heiti SC"/>
                 <w:b/>
                 <w:bCs w:val="1"/>
                 <w:color w:val="ffffff"/>
                 <w:sz w:val="17"/>
                 <w:rtl w:val="0"/>
               </w:rPr>
-              <w:t>Type</w:t>
+              <w:t>类型</w:t>
             </w:r>
           </w:p>
         </w:tc>
@@ -3111,14 +3116,14 @@
             </w:pPr>
             <w:r>
               <w:rPr>
-                <w:rFonts w:ascii="Arial Unicode MS" w:cs="Arial Unicode MS" w:eastAsia="Arial Unicode MS" w:hAnsi="Arial Unicode MS"/>
+                <w:rFonts w:ascii="Heiti SC" w:cs="Arial Unicode MS" w:eastAsia="Heiti SC" w:hAnsi="Heiti SC"/>
                 <w:b/>
                 <w:bCs w:val="1"/>
                 <w:color w:val="ffffff"/>
                 <w:sz w:val="17"/>
                 <w:rtl w:val="0"/>
               </w:rPr>
-              <w:t>Required</w:t>
+              <w:t>必需</w:t>
             </w:r>
           </w:p>
         </w:tc>
@@ -3148,14 +3153,14 @@
             </w:pPr>
             <w:r>
               <w:rPr>
-                <w:rFonts w:ascii="Arial Unicode MS" w:cs="Arial Unicode MS" w:eastAsia="Arial Unicode MS" w:hAnsi="Arial Unicode MS"/>
+                <w:rFonts w:ascii="Heiti SC" w:cs="Arial Unicode MS" w:eastAsia="Heiti SC" w:hAnsi="Heiti SC"/>
                 <w:b/>
                 <w:bCs w:val="1"/>
                 <w:color w:val="ffffff"/>
                 <w:sz w:val="17"/>
                 <w:rtl w:val="0"/>
               </w:rPr>
-              <w:t>Description</w:t>
+              <w:t>说明</w:t>
             </w:r>
           </w:p>
         </w:tc>
@@ -3191,7 +3196,7 @@
             </w:pPr>
             <w:r>
               <w:rPr>
-                <w:rFonts w:ascii="Arial Unicode MS" w:cs="Arial Unicode MS" w:eastAsia="Arial Unicode MS" w:hAnsi="Arial Unicode MS"/>
+                <w:rFonts w:ascii="Heiti SC" w:cs="Arial Unicode MS" w:eastAsia="Heiti SC" w:hAnsi="Heiti SC"/>
                 <w:b w:val="0"/>
                 <w:color w:val="233447"/>
                 <w:sz w:val="17"/>
@@ -3226,7 +3231,7 @@
             </w:pPr>
             <w:r>
               <w:rPr>
-                <w:rFonts w:ascii="Arial Unicode MS" w:cs="Arial Unicode MS" w:eastAsia="Arial Unicode MS" w:hAnsi="Arial Unicode MS"/>
+                <w:rFonts w:ascii="Heiti SC" w:cs="Arial Unicode MS" w:eastAsia="Heiti SC" w:hAnsi="Heiti SC"/>
                 <w:b w:val="0"/>
                 <w:color w:val="233447"/>
                 <w:sz w:val="17"/>
@@ -3261,48 +3266,48 @@
             </w:pPr>
             <w:r>
               <w:rPr>
-                <w:rFonts w:ascii="Arial Unicode MS" w:cs="Arial Unicode MS" w:eastAsia="Arial Unicode MS" w:hAnsi="Arial Unicode MS"/>
-                <w:b w:val="0"/>
-                <w:color w:val="233447"/>
-                <w:sz w:val="17"/>
-                <w:rtl w:val="0"/>
-              </w:rPr>
-              <w:t>Yes</w:t>
-            </w:r>
-          </w:p>
-        </w:tc>
-        <w:tc>
-          <w:tcPr>
-            <w:tcBorders>
-              <w:top w:color="ffffff" w:space="0" w:sz="6" w:val="single"/>
-              <w:left w:color="ffffff" w:space="0" w:sz="6" w:val="single"/>
-              <w:bottom w:color="ffffff" w:space="0" w:sz="6" w:val="single"/>
-              <w:right w:color="ffffff" w:space="0" w:sz="6" w:val="single"/>
-            </w:tcBorders>
-            <w:tcMar>
-              <w:top w:w="110.0" w:type="dxa"/>
-              <w:left w:w="120.0" w:type="dxa"/>
-              <w:bottom w:w="110.0" w:type="dxa"/>
-              <w:right w:w="120.0" w:type="dxa"/>
-            </w:tcMar>
-            <w:vAlign w:val="center"/>
-          </w:tcPr>
-          <w:p>
-            <w:pPr>
-              <w:spacing w:after="25" w:before="20" w:line="285" w:lineRule="auto"/>
-              <w:rPr>
-                <w:rFonts w:ascii="Helvetica Neue" w:cs="Helvetica Neue" w:eastAsia="Helvetica Neue" w:hAnsi="Helvetica Neue"/>
-              </w:rPr>
-            </w:pPr>
-            <w:r>
-              <w:rPr>
-                <w:rFonts w:ascii="Arial Unicode MS" w:cs="Arial Unicode MS" w:eastAsia="Arial Unicode MS" w:hAnsi="Arial Unicode MS"/>
-                <w:b w:val="0"/>
-                <w:color w:val="233447"/>
-                <w:sz w:val="17"/>
-                <w:rtl w:val="0"/>
-              </w:rPr>
-              <w:t>PDF path/hash, UniParser token/flags, and paper.md path; never the API key.</w:t>
+                <w:rFonts w:ascii="Heiti SC" w:cs="Arial Unicode MS" w:eastAsia="Heiti SC" w:hAnsi="Heiti SC"/>
+                <w:b w:val="0"/>
+                <w:color w:val="233447"/>
+                <w:sz w:val="17"/>
+                <w:rtl w:val="0"/>
+              </w:rPr>
+              <w:t>是</w:t>
+            </w:r>
+          </w:p>
+        </w:tc>
+        <w:tc>
+          <w:tcPr>
+            <w:tcBorders>
+              <w:top w:color="ffffff" w:space="0" w:sz="6" w:val="single"/>
+              <w:left w:color="ffffff" w:space="0" w:sz="6" w:val="single"/>
+              <w:bottom w:color="ffffff" w:space="0" w:sz="6" w:val="single"/>
+              <w:right w:color="ffffff" w:space="0" w:sz="6" w:val="single"/>
+            </w:tcBorders>
+            <w:tcMar>
+              <w:top w:w="110.0" w:type="dxa"/>
+              <w:left w:w="120.0" w:type="dxa"/>
+              <w:bottom w:w="110.0" w:type="dxa"/>
+              <w:right w:w="120.0" w:type="dxa"/>
+            </w:tcMar>
+            <w:vAlign w:val="center"/>
+          </w:tcPr>
+          <w:p>
+            <w:pPr>
+              <w:spacing w:after="25" w:before="20" w:line="285" w:lineRule="auto"/>
+              <w:rPr>
+                <w:rFonts w:ascii="Helvetica Neue" w:cs="Helvetica Neue" w:eastAsia="Helvetica Neue" w:hAnsi="Helvetica Neue"/>
+              </w:rPr>
+            </w:pPr>
+            <w:r>
+              <w:rPr>
+                <w:rFonts w:ascii="Heiti SC" w:cs="Arial Unicode MS" w:eastAsia="Heiti SC" w:hAnsi="Heiti SC"/>
+                <w:b w:val="0"/>
+                <w:color w:val="233447"/>
+                <w:sz w:val="17"/>
+                <w:rtl w:val="0"/>
+              </w:rPr>
+              <w:t>PDF路径/哈希、UniParser token/flags和paper.md路径；绝不记录API key。</w:t>
             </w:r>
           </w:p>
         </w:tc>
@@ -3338,7 +3343,7 @@
             </w:pPr>
             <w:r>
               <w:rPr>
-                <w:rFonts w:ascii="Arial Unicode MS" w:cs="Arial Unicode MS" w:eastAsia="Arial Unicode MS" w:hAnsi="Arial Unicode MS"/>
+                <w:rFonts w:ascii="Heiti SC" w:cs="Arial Unicode MS" w:eastAsia="Heiti SC" w:hAnsi="Heiti SC"/>
                 <w:b w:val="0"/>
                 <w:color w:val="233447"/>
                 <w:sz w:val="17"/>
@@ -3374,7 +3379,7 @@
             </w:pPr>
             <w:r>
               <w:rPr>
-                <w:rFonts w:ascii="Arial Unicode MS" w:cs="Arial Unicode MS" w:eastAsia="Arial Unicode MS" w:hAnsi="Arial Unicode MS"/>
+                <w:rFonts w:ascii="Heiti SC" w:cs="Arial Unicode MS" w:eastAsia="Heiti SC" w:hAnsi="Heiti SC"/>
                 <w:b w:val="0"/>
                 <w:color w:val="233447"/>
                 <w:sz w:val="17"/>
@@ -3410,13 +3415,13 @@
             </w:pPr>
             <w:r>
               <w:rPr>
-                <w:rFonts w:ascii="Arial Unicode MS" w:cs="Arial Unicode MS" w:eastAsia="Arial Unicode MS" w:hAnsi="Arial Unicode MS"/>
-                <w:b w:val="0"/>
-                <w:color w:val="233447"/>
-                <w:sz w:val="17"/>
-                <w:rtl w:val="0"/>
-              </w:rPr>
-              <w:t>Yes</w:t>
+                <w:rFonts w:ascii="Heiti SC" w:cs="Arial Unicode MS" w:eastAsia="Heiti SC" w:hAnsi="Heiti SC"/>
+                <w:b w:val="0"/>
+                <w:color w:val="233447"/>
+                <w:sz w:val="17"/>
+                <w:rtl w:val="0"/>
+              </w:rPr>
+              <w:t>是</w:t>
             </w:r>
           </w:p>
         </w:tc>
@@ -3446,13 +3451,13 @@
             </w:pPr>
             <w:r>
               <w:rPr>
-                <w:rFonts w:ascii="Arial Unicode MS" w:cs="Arial Unicode MS" w:eastAsia="Arial Unicode MS" w:hAnsi="Arial Unicode MS"/>
-                <w:b w:val="0"/>
-                <w:color w:val="233447"/>
-                <w:sz w:val="17"/>
-                <w:rtl w:val="0"/>
-              </w:rPr>
-              <w:t>Text/equation/table/caption completeness and blockers.</w:t>
+                <w:rFonts w:ascii="Heiti SC" w:cs="Arial Unicode MS" w:eastAsia="Heiti SC" w:hAnsi="Heiti SC"/>
+                <w:b w:val="0"/>
+                <w:color w:val="233447"/>
+                <w:sz w:val="17"/>
+                <w:rtl w:val="0"/>
+              </w:rPr>
+              <w:t>文本、公式、表格、图注完整性及blocker。</w:t>
             </w:r>
           </w:p>
         </w:tc>
@@ -3488,7 +3493,7 @@
             </w:pPr>
             <w:r>
               <w:rPr>
-                <w:rFonts w:ascii="Arial Unicode MS" w:cs="Arial Unicode MS" w:eastAsia="Arial Unicode MS" w:hAnsi="Arial Unicode MS"/>
+                <w:rFonts w:ascii="Heiti SC" w:cs="Arial Unicode MS" w:eastAsia="Heiti SC" w:hAnsi="Heiti SC"/>
                 <w:b w:val="0"/>
                 <w:color w:val="233447"/>
                 <w:sz w:val="17"/>
@@ -3524,7 +3529,7 @@
             </w:pPr>
             <w:r>
               <w:rPr>
-                <w:rFonts w:ascii="Arial Unicode MS" w:cs="Arial Unicode MS" w:eastAsia="Arial Unicode MS" w:hAnsi="Arial Unicode MS"/>
+                <w:rFonts w:ascii="Heiti SC" w:cs="Arial Unicode MS" w:eastAsia="Heiti SC" w:hAnsi="Heiti SC"/>
                 <w:b w:val="0"/>
                 <w:color w:val="233447"/>
                 <w:sz w:val="17"/>
@@ -3560,13 +3565,13 @@
             </w:pPr>
             <w:r>
               <w:rPr>
-                <w:rFonts w:ascii="Arial Unicode MS" w:cs="Arial Unicode MS" w:eastAsia="Arial Unicode MS" w:hAnsi="Arial Unicode MS"/>
-                <w:b w:val="0"/>
-                <w:color w:val="233447"/>
-                <w:sz w:val="17"/>
-                <w:rtl w:val="0"/>
-              </w:rPr>
-              <w:t>Yes</w:t>
+                <w:rFonts w:ascii="Heiti SC" w:cs="Arial Unicode MS" w:eastAsia="Heiti SC" w:hAnsi="Heiti SC"/>
+                <w:b w:val="0"/>
+                <w:color w:val="233447"/>
+                <w:sz w:val="17"/>
+                <w:rtl w:val="0"/>
+              </w:rPr>
+              <w:t>是</w:t>
             </w:r>
           </w:p>
         </w:tc>
@@ -3596,13 +3601,13 @@
             </w:pPr>
             <w:r>
               <w:rPr>
-                <w:rFonts w:ascii="Arial Unicode MS" w:cs="Arial Unicode MS" w:eastAsia="Arial Unicode MS" w:hAnsi="Arial Unicode MS"/>
-                <w:b w:val="0"/>
-                <w:color w:val="233447"/>
-                <w:sz w:val="17"/>
-                <w:rtl w:val="0"/>
-              </w:rPr>
-              <w:t>Q0, Gold, resources, checkpoints, and SELECTED/REJECTED decision for each candidate.</w:t>
+                <w:rFonts w:ascii="Heiti SC" w:cs="Arial Unicode MS" w:eastAsia="Heiti SC" w:hAnsi="Heiti SC"/>
+                <w:b w:val="0"/>
+                <w:color w:val="233447"/>
+                <w:sz w:val="17"/>
+                <w:rtl w:val="0"/>
+              </w:rPr>
+              <w:t>每个候选的Q0、Gold、资源、checkpoint及SELECTED/REJECTED决定。</w:t>
             </w:r>
           </w:p>
         </w:tc>
@@ -3638,7 +3643,7 @@
             </w:pPr>
             <w:r>
               <w:rPr>
-                <w:rFonts w:ascii="Arial Unicode MS" w:cs="Arial Unicode MS" w:eastAsia="Arial Unicode MS" w:hAnsi="Arial Unicode MS"/>
+                <w:rFonts w:ascii="Heiti SC" w:cs="Arial Unicode MS" w:eastAsia="Heiti SC" w:hAnsi="Heiti SC"/>
                 <w:b w:val="0"/>
                 <w:color w:val="233447"/>
                 <w:sz w:val="17"/>
@@ -3674,7 +3679,7 @@
             </w:pPr>
             <w:r>
               <w:rPr>
-                <w:rFonts w:ascii="Arial Unicode MS" w:cs="Arial Unicode MS" w:eastAsia="Arial Unicode MS" w:hAnsi="Arial Unicode MS"/>
+                <w:rFonts w:ascii="Heiti SC" w:cs="Arial Unicode MS" w:eastAsia="Heiti SC" w:hAnsi="Heiti SC"/>
                 <w:b w:val="0"/>
                 <w:color w:val="233447"/>
                 <w:sz w:val="17"/>
@@ -3710,13 +3715,13 @@
             </w:pPr>
             <w:r>
               <w:rPr>
-                <w:rFonts w:ascii="Arial Unicode MS" w:cs="Arial Unicode MS" w:eastAsia="Arial Unicode MS" w:hAnsi="Arial Unicode MS"/>
-                <w:b w:val="0"/>
-                <w:color w:val="233447"/>
-                <w:sz w:val="17"/>
-                <w:rtl w:val="0"/>
-              </w:rPr>
-              <w:t>Yes</w:t>
+                <w:rFonts w:ascii="Heiti SC" w:cs="Arial Unicode MS" w:eastAsia="Heiti SC" w:hAnsi="Heiti SC"/>
+                <w:b w:val="0"/>
+                <w:color w:val="233447"/>
+                <w:sz w:val="17"/>
+                <w:rtl w:val="0"/>
+              </w:rPr>
+              <w:t>是</w:t>
             </w:r>
           </w:p>
         </w:tc>
@@ -3746,13 +3751,13 @@
             </w:pPr>
             <w:r>
               <w:rPr>
-                <w:rFonts w:ascii="Arial Unicode MS" w:cs="Arial Unicode MS" w:eastAsia="Arial Unicode MS" w:hAnsi="Arial Unicode MS"/>
-                <w:b w:val="0"/>
-                <w:color w:val="233447"/>
-                <w:sz w:val="17"/>
-                <w:rtl w:val="0"/>
-              </w:rPr>
-              <w:t>Four parameter classes plus three unique-value booleans that expose hidden fixation.</w:t>
+                <w:rFonts w:ascii="Heiti SC" w:cs="Arial Unicode MS" w:eastAsia="Heiti SC" w:hAnsi="Heiti SC"/>
+                <w:b w:val="0"/>
+                <w:color w:val="233447"/>
+                <w:sz w:val="17"/>
+                <w:rtl w:val="0"/>
+              </w:rPr>
+              <w:t>四类参数加3个唯一值布尔量，用于暴露隐藏固定。</w:t>
             </w:r>
           </w:p>
         </w:tc>
@@ -3788,13 +3793,13 @@
             </w:pPr>
             <w:r>
               <w:rPr>
-                <w:rFonts w:ascii="Arial Unicode MS" w:cs="Arial Unicode MS" w:eastAsia="Arial Unicode MS" w:hAnsi="Arial Unicode MS"/>
-                <w:b w:val="0"/>
-                <w:color w:val="233447"/>
-                <w:sz w:val="17"/>
-                <w:rtl w:val="0"/>
-              </w:rPr>
-              <w:t>condition_group_records + gold_records</w:t>
+                <w:rFonts w:ascii="Heiti SC" w:cs="Arial Unicode MS" w:eastAsia="Heiti SC" w:hAnsi="Heiti SC"/>
+                <w:b w:val="0"/>
+                <w:color w:val="233447"/>
+                <w:sz w:val="17"/>
+                <w:rtl w:val="0"/>
+              </w:rPr>
+              <w:t>condition_group_records＋gold_records</w:t>
             </w:r>
           </w:p>
         </w:tc>
@@ -3824,7 +3829,7 @@
             </w:pPr>
             <w:r>
               <w:rPr>
-                <w:rFonts w:ascii="Arial Unicode MS" w:cs="Arial Unicode MS" w:eastAsia="Arial Unicode MS" w:hAnsi="Arial Unicode MS"/>
+                <w:rFonts w:ascii="Heiti SC" w:cs="Arial Unicode MS" w:eastAsia="Heiti SC" w:hAnsi="Heiti SC"/>
                 <w:b w:val="0"/>
                 <w:color w:val="233447"/>
                 <w:sz w:val="17"/>
@@ -3860,13 +3865,13 @@
             </w:pPr>
             <w:r>
               <w:rPr>
-                <w:rFonts w:ascii="Arial Unicode MS" w:cs="Arial Unicode MS" w:eastAsia="Arial Unicode MS" w:hAnsi="Arial Unicode MS"/>
-                <w:b w:val="0"/>
-                <w:color w:val="233447"/>
-                <w:sz w:val="17"/>
-                <w:rtl w:val="0"/>
-              </w:rPr>
-              <w:t>Yes</w:t>
+                <w:rFonts w:ascii="Heiti SC" w:cs="Arial Unicode MS" w:eastAsia="Heiti SC" w:hAnsi="Heiti SC"/>
+                <w:b w:val="0"/>
+                <w:color w:val="233447"/>
+                <w:sz w:val="17"/>
+                <w:rtl w:val="0"/>
+              </w:rPr>
+              <w:t>是</w:t>
             </w:r>
           </w:p>
         </w:tc>
@@ -3896,13 +3901,13 @@
             </w:pPr>
             <w:r>
               <w:rPr>
-                <w:rFonts w:ascii="Arial Unicode MS" w:cs="Arial Unicode MS" w:eastAsia="Arial Unicode MS" w:hAnsi="Arial Unicode MS"/>
-                <w:b w:val="0"/>
-                <w:color w:val="233447"/>
-                <w:sz w:val="17"/>
-                <w:rtl w:val="0"/>
-              </w:rPr>
-              <w:t>Complete signatures, target mapping, policy, applicability, and provenance.</w:t>
+                <w:rFonts w:ascii="Heiti SC" w:cs="Arial Unicode MS" w:eastAsia="Heiti SC" w:hAnsi="Heiti SC"/>
+                <w:b w:val="0"/>
+                <w:color w:val="233447"/>
+                <w:sz w:val="17"/>
+                <w:rtl w:val="0"/>
+              </w:rPr>
+              <w:t>完整条件签名、target映射、policy、适用性和来源。</w:t>
             </w:r>
           </w:p>
         </w:tc>
@@ -3938,13 +3943,13 @@
             </w:pPr>
             <w:r>
               <w:rPr>
-                <w:rFonts w:ascii="Arial Unicode MS" w:cs="Arial Unicode MS" w:eastAsia="Arial Unicode MS" w:hAnsi="Arial Unicode MS"/>
-                <w:b w:val="0"/>
-                <w:color w:val="233447"/>
-                <w:sz w:val="17"/>
-                <w:rtl w:val="0"/>
-              </w:rPr>
-              <w:t>enhancement + probe_records</w:t>
+                <w:rFonts w:ascii="Heiti SC" w:cs="Arial Unicode MS" w:eastAsia="Heiti SC" w:hAnsi="Heiti SC"/>
+                <w:b w:val="0"/>
+                <w:color w:val="233447"/>
+                <w:sz w:val="17"/>
+                <w:rtl w:val="0"/>
+              </w:rPr>
+              <w:t>enhancement＋probe_records</w:t>
             </w:r>
           </w:p>
         </w:tc>
@@ -3974,7 +3979,7 @@
             </w:pPr>
             <w:r>
               <w:rPr>
-                <w:rFonts w:ascii="Arial Unicode MS" w:cs="Arial Unicode MS" w:eastAsia="Arial Unicode MS" w:hAnsi="Arial Unicode MS"/>
+                <w:rFonts w:ascii="Heiti SC" w:cs="Arial Unicode MS" w:eastAsia="Heiti SC" w:hAnsi="Heiti SC"/>
                 <w:b w:val="0"/>
                 <w:color w:val="233447"/>
                 <w:sz w:val="17"/>
@@ -4010,13 +4015,13 @@
             </w:pPr>
             <w:r>
               <w:rPr>
-                <w:rFonts w:ascii="Arial Unicode MS" w:cs="Arial Unicode MS" w:eastAsia="Arial Unicode MS" w:hAnsi="Arial Unicode MS"/>
-                <w:b w:val="0"/>
-                <w:color w:val="233447"/>
-                <w:sz w:val="17"/>
-                <w:rtl w:val="0"/>
-              </w:rPr>
-              <w:t>Yes</w:t>
+                <w:rFonts w:ascii="Heiti SC" w:cs="Arial Unicode MS" w:eastAsia="Heiti SC" w:hAnsi="Heiti SC"/>
+                <w:b w:val="0"/>
+                <w:color w:val="233447"/>
+                <w:sz w:val="17"/>
+                <w:rtl w:val="0"/>
+              </w:rPr>
+              <w:t>是</w:t>
             </w:r>
           </w:p>
         </w:tc>
@@ -4046,13 +4051,13 @@
             </w:pPr>
             <w:r>
               <w:rPr>
-                <w:rFonts w:ascii="Arial Unicode MS" w:cs="Arial Unicode MS" w:eastAsia="Arial Unicode MS" w:hAnsi="Arial Unicode MS"/>
-                <w:b w:val="0"/>
-                <w:color w:val="233447"/>
-                <w:sz w:val="17"/>
-                <w:rtl w:val="0"/>
-              </w:rPr>
-              <w:t>Gold/result weights, result checks, five Baseline probes, and at least one enhanced probe.</w:t>
+                <w:rFonts w:ascii="Heiti SC" w:cs="Arial Unicode MS" w:eastAsia="Heiti SC" w:hAnsi="Heiti SC"/>
+                <w:b w:val="0"/>
+                <w:color w:val="233447"/>
+                <w:sz w:val="17"/>
+                <w:rtl w:val="0"/>
+              </w:rPr>
+              <w:t>Gold/结果权重、结果检查、5个Baseline probe和至少1个enhanced probe。</w:t>
             </w:r>
           </w:p>
         </w:tc>
@@ -4088,13 +4093,13 @@
             </w:pPr>
             <w:r>
               <w:rPr>
-                <w:rFonts w:ascii="Arial Unicode MS" w:cs="Arial Unicode MS" w:eastAsia="Arial Unicode MS" w:hAnsi="Arial Unicode MS"/>
-                <w:b w:val="0"/>
-                <w:color w:val="233447"/>
-                <w:sz w:val="17"/>
-                <w:rtl w:val="0"/>
-              </w:rPr>
-              <w:t>checker_cost_record + independent_review</w:t>
+                <w:rFonts w:ascii="Heiti SC" w:cs="Arial Unicode MS" w:eastAsia="Heiti SC" w:hAnsi="Heiti SC"/>
+                <w:b w:val="0"/>
+                <w:color w:val="233447"/>
+                <w:sz w:val="17"/>
+                <w:rtl w:val="0"/>
+              </w:rPr>
+              <w:t>checker_cost_record＋independent_review</w:t>
             </w:r>
           </w:p>
         </w:tc>
@@ -4124,7 +4129,7 @@
             </w:pPr>
             <w:r>
               <w:rPr>
-                <w:rFonts w:ascii="Arial Unicode MS" w:cs="Arial Unicode MS" w:eastAsia="Arial Unicode MS" w:hAnsi="Arial Unicode MS"/>
+                <w:rFonts w:ascii="Heiti SC" w:cs="Arial Unicode MS" w:eastAsia="Heiti SC" w:hAnsi="Heiti SC"/>
                 <w:b w:val="0"/>
                 <w:color w:val="233447"/>
                 <w:sz w:val="17"/>
@@ -4160,13 +4165,13 @@
             </w:pPr>
             <w:r>
               <w:rPr>
-                <w:rFonts w:ascii="Arial Unicode MS" w:cs="Arial Unicode MS" w:eastAsia="Arial Unicode MS" w:hAnsi="Arial Unicode MS"/>
-                <w:b w:val="0"/>
-                <w:color w:val="233447"/>
-                <w:sz w:val="17"/>
-                <w:rtl w:val="0"/>
-              </w:rPr>
-              <w:t>Yes</w:t>
+                <w:rFonts w:ascii="Heiti SC" w:cs="Arial Unicode MS" w:eastAsia="Heiti SC" w:hAnsi="Heiti SC"/>
+                <w:b w:val="0"/>
+                <w:color w:val="233447"/>
+                <w:sz w:val="17"/>
+                <w:rtl w:val="0"/>
+              </w:rPr>
+              <w:t>是</w:t>
             </w:r>
           </w:p>
         </w:tc>
@@ -4190,10 +4195,10 @@
           <w:p>
             <w:r>
               <w:rPr>
-                <w:rFonts w:ascii="Arial Unicode MS" w:hAnsi="Arial Unicode MS"/>
-                <w:sz w:val="17"/>
-              </w:rPr>
-              <w:t>Real-scale cost and final verdict/quality_tier/publishable; validator runs the complete materials-core-review/3.3 artifact and package-aware consistency checks.</w:t>
+                <w:rFonts w:ascii="Heiti SC" w:hAnsi="Heiti SC" w:eastAsia="Heiti SC"/>
+                <w:sz w:val="17"/>
+              </w:rPr>
+              <w:t>真实规模成本和最终verdict/quality_tier/publishable；validator运行完整materials-core-review/3.3 artifact和题包级一致性检查。</w:t>
             </w:r>
           </w:p>
         </w:tc>
@@ -4224,10 +4229,10 @@
       <w:bookmarkEnd w:id="5"/>
       <w:r>
         <w:rPr>
-          <w:rFonts w:ascii="Arial Unicode MS" w:hAnsi="Arial Unicode MS" w:eastAsia="Arial Unicode MS" w:cs="Arial Unicode MS"/>
+          <w:rFonts w:ascii="Heiti SC" w:hAnsi="Heiti SC" w:eastAsia="Heiti SC" w:cs="Arial Unicode MS"/>
           <w:rtl w:val="0"/>
         </w:rPr>
-        <w:t>Contract guarantees</w:t>
+        <w:t>合同保证</w:t>
       </w:r>
     </w:p>
     <w:p>
@@ -4240,7 +4245,10 @@
         </w:rPr>
       </w:pPr>
       <w:r>
-        <w:t>The authoring record is the single external source of truth for authoring decisions; the Harbor candidate stores only solver/reviewer package files. Publish validation runs the complete materials-core-review/3.3 validator and its package-aware tier, weight, and tolerance checks; legacy lowercase scoring_tier cannot bypass this gate.</w:t>
+        <w:rPr>
+          <w:rFonts w:ascii="Heiti SC" w:hAnsi="Heiti SC" w:eastAsia="Heiti SC"/>
+        </w:rPr>
+        <w:t>authoring_record.json是编写决策的题包外唯一事实源；Harbor候选只保存solver/reviewer可用的题包文件。发布校验会运行完整materials-core-review/3.3 validator及其题包级tier、权重和容差一致性检查；旧式小写scoring_tier不能绕过此门槛。</w:t>
       </w:r>
     </w:p>
     <w:p>
@@ -4266,7 +4274,7 @@
       </w:pPr>
       <w:r>
         <w:rPr>
-          <w:rFonts w:ascii="Arial Unicode MS" w:cs="Arial Unicode MS" w:eastAsia="Arial Unicode MS" w:hAnsi="Arial Unicode MS"/>
+          <w:rFonts w:ascii="Heiti SC" w:cs="Arial Unicode MS" w:eastAsia="Heiti SC" w:hAnsi="Heiti SC"/>
           <w:i w:val="0"/>
           <w:iCs w:val="0"/>
           <w:smallCaps w:val="0"/>
@@ -4279,7 +4287,7 @@
           <w:vertAlign w:val="baseline"/>
           <w:rtl w:val="0"/>
         </w:rPr>
-        <w:t>• instruction.md precedes all derived views; tests cannot add public requirements.</w:t>
+        <w:t>• instruction.md先于所有派生视图；tests不得新增公开要求。</w:t>
       </w:r>
     </w:p>
     <w:p>
@@ -4304,7 +4312,10 @@
         </w:rPr>
       </w:pPr>
       <w:r>
-        <w:t>• Every target, condition, resource, workflow, and output ID is unique and closed; resource records, resources.json, mapping types, bundled filenames, and files must agree.</w:t>
+        <w:rPr>
+          <w:rFonts w:ascii="Heiti SC" w:hAnsi="Heiti SC" w:eastAsia="Heiti SC"/>
+        </w:rPr>
+        <w:t>• target、condition、resource、workflow和output ID必须唯一且闭环；resource_records、resources.json、mapping type、bundled filename和实际文件必须一致。</w:t>
       </w:r>
     </w:p>
     <w:p>
@@ -4329,7 +4340,10 @@
         </w:rPr>
       </w:pPr>
       <w:r>
-        <w:t>• Bundled authoring files live at resources/&lt;filename&gt;; instruction uses filename only; deployment locator is late-bound. Output paths are canonical below /app/outputs; paper_id cannot be a path or the reserved solution name.</w:t>
+        <w:rPr>
+          <w:rFonts w:ascii="Heiti SC" w:hAnsi="Heiti SC" w:eastAsia="Heiti SC"/>
+        </w:rPr>
+        <w:t>• 编写期bundled文件位于resources/&lt;filename&gt;；instruction只写文件名，部署locator后绑定。输出必须是/app/outputs下的规范路径；paper_id不能是路径，也不能使用保留名solution。</w:t>
       </w:r>
     </w:p>
     <w:p>
@@ -4354,7 +4368,10 @@
         </w:rPr>
       </w:pPr>
       <w:r>
-        <w:t>• Source hash, parse flags, Gold provenance, tolerance boundary, and the complete external Review artifact support audit and replay; four-field Review stubs are rejected.</w:t>
+        <w:rPr>
+          <w:rFonts w:ascii="Heiti SC" w:hAnsi="Heiti SC" w:eastAsia="Heiti SC"/>
+        </w:rPr>
+        <w:t>• 源文件哈希、解析参数、Gold来源、容差边界和完整的题包外Review artifact共同支持审计与重放；仅含4个字段的Review stub会被拒绝。</w:t>
       </w:r>
     </w:p>
     <w:p>
@@ -4366,11 +4383,11 @@
       </w:pPr>
       <w:r>
         <w:rPr>
-          <w:rFonts w:ascii="Arial Unicode MS" w:cs="Arial Unicode MS" w:eastAsia="Arial Unicode MS" w:hAnsi="Arial Unicode MS"/>
+          <w:rFonts w:ascii="Heiti SC" w:cs="Arial Unicode MS" w:eastAsia="Heiti SC" w:hAnsi="Heiti SC"/>
           <w:color w:val="233447"/>
           <w:rtl w:val="0"/>
         </w:rPr>
-        <w:t>Schema and implementation:</w:t>
+        <w:t>Schema与实现：</w:t>
       </w:r>
     </w:p>
     <w:p>
@@ -4381,7 +4398,10 @@
         </w:rPr>
       </w:pPr>
       <w:r>
-        <w:t>.cursor/skills/materials-benchmark-authoring/: assets/authoring_record_template.json and scripts/validate_authoring_record.py.</w:t>
+        <w:rPr>
+          <w:rFonts w:ascii="Heiti SC" w:hAnsi="Heiti SC" w:eastAsia="Heiti SC"/>
+        </w:rPr>
+        <w:t>.cursor/skills/materials-benchmark-authoring/：assets/authoring_record_template.json与scripts/validate_authoring_record.py。</w:t>
       </w:r>
     </w:p>
     <w:p>
@@ -4408,10 +4428,10 @@
       </w:pPr>
       <w:r>
         <w:rPr>
-          <w:rFonts w:ascii="Arial Unicode MS" w:cs="Arial Unicode MS" w:eastAsia="Arial Unicode MS" w:hAnsi="Arial Unicode MS"/>
+          <w:rFonts w:ascii="Heiti SC" w:cs="Arial Unicode MS" w:eastAsia="Heiti SC" w:hAnsi="Heiti SC"/>
           <w:rtl w:val="0"/>
         </w:rPr>
-        <w:t>7.  Consistency, Idempotency, and Replay</w:t>
+        <w:t>7.  一致性、幂等与重放</w:t>
       </w:r>
     </w:p>
     <w:p>
@@ -4437,11 +4457,11 @@
       </w:pPr>
       <w:r>
         <w:rPr>
-          <w:rFonts w:ascii="Arial Unicode MS" w:cs="Arial Unicode MS" w:eastAsia="Arial Unicode MS" w:hAnsi="Arial Unicode MS"/>
+          <w:rFonts w:ascii="Heiti SC" w:cs="Arial Unicode MS" w:eastAsia="Heiti SC" w:hAnsi="Heiti SC"/>
           <w:color w:val="233447"/>
           <w:rtl w:val="0"/>
         </w:rPr>
-        <w:t>Concurrent work is isolated by authoring_id; the design adds no global lock or dispatcher. Human prompts coordinate publishing and corpus_review_tracking.json updates. Source PDF, evidence, and candidate are never silently overwritten to manufacture a latest version.</w:t>
+        <w:t>并行工作按authoring_id隔离；系统不新增全局锁或dispatcher。发布和corpus_review_tracking.json更新由人工prompt协调。源PDF、证据和候选不会被静默覆盖来伪造所谓“最新版本”。</w:t>
       </w:r>
     </w:p>
     <w:tbl>
@@ -4503,14 +4523,14 @@
             </w:pPr>
             <w:r>
               <w:rPr>
-                <w:rFonts w:ascii="Arial Unicode MS" w:cs="Arial Unicode MS" w:eastAsia="Arial Unicode MS" w:hAnsi="Arial Unicode MS"/>
+                <w:rFonts w:ascii="Heiti SC" w:cs="Arial Unicode MS" w:eastAsia="Heiti SC" w:hAnsi="Heiti SC"/>
                 <w:b/>
                 <w:bCs w:val="1"/>
                 <w:color w:val="ffffff"/>
                 <w:sz w:val="17"/>
                 <w:rtl w:val="0"/>
               </w:rPr>
-              <w:t>Scenario</w:t>
+              <w:t>情形</w:t>
             </w:r>
           </w:p>
         </w:tc>
@@ -4540,14 +4560,14 @@
             </w:pPr>
             <w:r>
               <w:rPr>
-                <w:rFonts w:ascii="Arial Unicode MS" w:cs="Arial Unicode MS" w:eastAsia="Arial Unicode MS" w:hAnsi="Arial Unicode MS"/>
+                <w:rFonts w:ascii="Heiti SC" w:cs="Arial Unicode MS" w:eastAsia="Heiti SC" w:hAnsi="Heiti SC"/>
                 <w:b/>
                 <w:bCs w:val="1"/>
                 <w:color w:val="ffffff"/>
                 <w:sz w:val="17"/>
                 <w:rtl w:val="0"/>
               </w:rPr>
-              <w:t>Expected behavior</w:t>
+              <w:t>预期行为</w:t>
             </w:r>
           </w:p>
         </w:tc>
@@ -4577,14 +4597,14 @@
             </w:pPr>
             <w:r>
               <w:rPr>
-                <w:rFonts w:ascii="Arial Unicode MS" w:cs="Arial Unicode MS" w:eastAsia="Arial Unicode MS" w:hAnsi="Arial Unicode MS"/>
+                <w:rFonts w:ascii="Heiti SC" w:cs="Arial Unicode MS" w:eastAsia="Heiti SC" w:hAnsi="Heiti SC"/>
                 <w:b/>
                 <w:bCs w:val="1"/>
                 <w:color w:val="ffffff"/>
                 <w:sz w:val="17"/>
                 <w:rtl w:val="0"/>
               </w:rPr>
-              <w:t>Reasoning</w:t>
+              <w:t>原因</w:t>
             </w:r>
           </w:p>
         </w:tc>
@@ -4620,13 +4640,13 @@
             </w:pPr>
             <w:r>
               <w:rPr>
-                <w:rFonts w:ascii="Arial Unicode MS" w:cs="Arial Unicode MS" w:eastAsia="Arial Unicode MS" w:hAnsi="Arial Unicode MS"/>
-                <w:b w:val="0"/>
-                <w:color w:val="233447"/>
-                <w:sz w:val="17"/>
-                <w:rtl w:val="0"/>
-              </w:rPr>
-              <w:t>Same PDF submitted again</w:t>
+                <w:rFonts w:ascii="Heiti SC" w:cs="Arial Unicode MS" w:eastAsia="Heiti SC" w:hAnsi="Heiti SC"/>
+                <w:b w:val="0"/>
+                <w:color w:val="233447"/>
+                <w:sz w:val="17"/>
+                <w:rtl w:val="0"/>
+              </w:rPr>
+              <w:t>再次提交同一PDF</w:t>
             </w:r>
           </w:p>
         </w:tc>
@@ -4656,13 +4676,13 @@
             </w:pPr>
             <w:r>
               <w:rPr>
-                <w:rFonts w:ascii="Arial Unicode MS" w:cs="Arial Unicode MS" w:eastAsia="Arial Unicode MS" w:hAnsi="Arial Unicode MS"/>
-                <w:b w:val="0"/>
-                <w:color w:val="233447"/>
-                <w:sz w:val="17"/>
-                <w:rtl w:val="0"/>
-              </w:rPr>
-              <w:t>Reuse a complete parse for the same hash; issue a new authoring_id for a different hash.</w:t>
+                <w:rFonts w:ascii="Heiti SC" w:cs="Arial Unicode MS" w:eastAsia="Heiti SC" w:hAnsi="Heiti SC"/>
+                <w:b w:val="0"/>
+                <w:color w:val="233447"/>
+                <w:sz w:val="17"/>
+                <w:rtl w:val="0"/>
+              </w:rPr>
+              <w:t>同一哈希复用完整解析；哈希不同则分配新的authoring_id。</w:t>
             </w:r>
           </w:p>
         </w:tc>
@@ -4692,13 +4712,13 @@
             </w:pPr>
             <w:r>
               <w:rPr>
-                <w:rFonts w:ascii="Arial Unicode MS" w:cs="Arial Unicode MS" w:eastAsia="Arial Unicode MS" w:hAnsi="Arial Unicode MS"/>
-                <w:b w:val="0"/>
-                <w:color w:val="233447"/>
-                <w:sz w:val="17"/>
-                <w:rtl w:val="0"/>
-              </w:rPr>
-              <w:t>Prevents stale paper.md from being paired with a new PDF.</w:t>
+                <w:rFonts w:ascii="Heiti SC" w:cs="Arial Unicode MS" w:eastAsia="Heiti SC" w:hAnsi="Heiti SC"/>
+                <w:b w:val="0"/>
+                <w:color w:val="233447"/>
+                <w:sz w:val="17"/>
+                <w:rtl w:val="0"/>
+              </w:rPr>
+              <w:t>防止旧paper.md与新PDF错误配对。</w:t>
             </w:r>
           </w:p>
         </w:tc>
@@ -4734,13 +4754,13 @@
             </w:pPr>
             <w:r>
               <w:rPr>
-                <w:rFonts w:ascii="Arial Unicode MS" w:cs="Arial Unicode MS" w:eastAsia="Arial Unicode MS" w:hAnsi="Arial Unicode MS"/>
-                <w:b w:val="0"/>
-                <w:color w:val="233447"/>
-                <w:sz w:val="17"/>
-                <w:rtl w:val="0"/>
-              </w:rPr>
-              <w:t>Parse, Gold, or resource write fails</w:t>
+                <w:rFonts w:ascii="Heiti SC" w:cs="Arial Unicode MS" w:eastAsia="Heiti SC" w:hAnsi="Heiti SC"/>
+                <w:b w:val="0"/>
+                <w:color w:val="233447"/>
+                <w:sz w:val="17"/>
+                <w:rtl w:val="0"/>
+              </w:rPr>
+              <w:t>解析、Gold或资源写入失败</w:t>
             </w:r>
           </w:p>
         </w:tc>
@@ -4770,13 +4790,13 @@
             </w:pPr>
             <w:r>
               <w:rPr>
-                <w:rFonts w:ascii="Arial Unicode MS" w:cs="Arial Unicode MS" w:eastAsia="Arial Unicode MS" w:hAnsi="Arial Unicode MS"/>
-                <w:b w:val="0"/>
-                <w:color w:val="233447"/>
-                <w:sz w:val="17"/>
-                <w:rtl w:val="0"/>
-              </w:rPr>
-              <w:t>Emit no publish candidate; record blocker and last successful stage.</w:t>
+                <w:rFonts w:ascii="Heiti SC" w:cs="Arial Unicode MS" w:eastAsia="Heiti SC" w:hAnsi="Heiti SC"/>
+                <w:b w:val="0"/>
+                <w:color w:val="233447"/>
+                <w:sz w:val="17"/>
+                <w:rtl w:val="0"/>
+              </w:rPr>
+              <w:t>不输出可发布候选；记录blocker和最后成功阶段。</w:t>
             </w:r>
           </w:p>
         </w:tc>
@@ -4806,13 +4826,13 @@
             </w:pPr>
             <w:r>
               <w:rPr>
-                <w:rFonts w:ascii="Arial Unicode MS" w:cs="Arial Unicode MS" w:eastAsia="Arial Unicode MS" w:hAnsi="Arial Unicode MS"/>
-                <w:b w:val="0"/>
-                <w:color w:val="233447"/>
-                <w:sz w:val="17"/>
-                <w:rtl w:val="0"/>
-              </w:rPr>
-              <w:t>Fail closed so partial evidence is never treated as complete.</w:t>
+                <w:rFonts w:ascii="Heiti SC" w:cs="Arial Unicode MS" w:eastAsia="Heiti SC" w:hAnsi="Heiti SC"/>
+                <w:b w:val="0"/>
+                <w:color w:val="233447"/>
+                <w:sz w:val="17"/>
+                <w:rtl w:val="0"/>
+              </w:rPr>
+              <w:t>封闭失败，避免把部分证据当作完整证据。</w:t>
             </w:r>
           </w:p>
         </w:tc>
@@ -4848,13 +4868,13 @@
             </w:pPr>
             <w:r>
               <w:rPr>
-                <w:rFonts w:ascii="Arial Unicode MS" w:cs="Arial Unicode MS" w:eastAsia="Arial Unicode MS" w:hAnsi="Arial Unicode MS"/>
-                <w:b w:val="0"/>
-                <w:color w:val="233447"/>
-                <w:sz w:val="17"/>
-                <w:rtl w:val="0"/>
-              </w:rPr>
-              <w:t>Checker probe, cost, or Review fails</w:t>
+                <w:rFonts w:ascii="Heiti SC" w:cs="Arial Unicode MS" w:eastAsia="Heiti SC" w:hAnsi="Heiti SC"/>
+                <w:b w:val="0"/>
+                <w:color w:val="233447"/>
+                <w:sz w:val="17"/>
+                <w:rtl w:val="0"/>
+              </w:rPr>
+              <w:t>checker probe、cost或Review失败</w:t>
             </w:r>
           </w:p>
         </w:tc>
@@ -4884,13 +4904,13 @@
             </w:pPr>
             <w:r>
               <w:rPr>
-                <w:rFonts w:ascii="Arial Unicode MS" w:cs="Arial Unicode MS" w:eastAsia="Arial Unicode MS" w:hAnsi="Arial Unicode MS"/>
-                <w:b w:val="0"/>
-                <w:color w:val="233447"/>
-                <w:sz w:val="17"/>
-                <w:rtl w:val="0"/>
-              </w:rPr>
-              <w:t>Keep candidate and evidence; revise from the corresponding upstream layer; do not publish.</w:t>
+                <w:rFonts w:ascii="Heiti SC" w:cs="Arial Unicode MS" w:eastAsia="Heiti SC" w:hAnsi="Heiti SC"/>
+                <w:b w:val="0"/>
+                <w:color w:val="233447"/>
+                <w:sz w:val="17"/>
+                <w:rtl w:val="0"/>
+              </w:rPr>
+              <w:t>保留候选和证据；从对应上游层修订；不得发布。</w:t>
             </w:r>
           </w:p>
         </w:tc>
@@ -4920,13 +4940,13 @@
             </w:pPr>
             <w:r>
               <w:rPr>
-                <w:rFonts w:ascii="Arial Unicode MS" w:cs="Arial Unicode MS" w:eastAsia="Arial Unicode MS" w:hAnsi="Arial Unicode MS"/>
-                <w:b w:val="0"/>
-                <w:color w:val="233447"/>
-                <w:sz w:val="17"/>
-                <w:rtl w:val="0"/>
-              </w:rPr>
-              <w:t>Keeps the repair loop inside the authoring workspace.</w:t>
+                <w:rFonts w:ascii="Heiti SC" w:cs="Arial Unicode MS" w:eastAsia="Heiti SC" w:hAnsi="Heiti SC"/>
+                <w:b w:val="0"/>
+                <w:color w:val="233447"/>
+                <w:sz w:val="17"/>
+                <w:rtl w:val="0"/>
+              </w:rPr>
+              <w:t>修订循环留在Authoring工作区内。</w:t>
             </w:r>
           </w:p>
         </w:tc>
@@ -4962,13 +4982,13 @@
             </w:pPr>
             <w:r>
               <w:rPr>
-                <w:rFonts w:ascii="Arial Unicode MS" w:cs="Arial Unicode MS" w:eastAsia="Arial Unicode MS" w:hAnsi="Arial Unicode MS"/>
-                <w:b w:val="0"/>
-                <w:color w:val="233447"/>
-                <w:sz w:val="17"/>
-                <w:rtl w:val="0"/>
-              </w:rPr>
-              <w:t>Rules or Harbor schema change</w:t>
+                <w:rFonts w:ascii="Heiti SC" w:cs="Arial Unicode MS" w:eastAsia="Heiti SC" w:hAnsi="Heiti SC"/>
+                <w:b w:val="0"/>
+                <w:color w:val="233447"/>
+                <w:sz w:val="17"/>
+                <w:rtl w:val="0"/>
+              </w:rPr>
+              <w:t>规则或Harbor schema变化</w:t>
             </w:r>
           </w:p>
         </w:tc>
@@ -4998,13 +5018,13 @@
             </w:pPr>
             <w:r>
               <w:rPr>
-                <w:rFonts w:ascii="Arial Unicode MS" w:cs="Arial Unicode MS" w:eastAsia="Arial Unicode MS" w:hAnsi="Arial Unicode MS"/>
-                <w:b w:val="0"/>
-                <w:color w:val="233447"/>
-                <w:sz w:val="17"/>
-                <w:rtl w:val="0"/>
-              </w:rPr>
-              <w:t>Capture Skill/Review versions; rerun static validation and independent Review.</w:t>
+                <w:rFonts w:ascii="Heiti SC" w:cs="Arial Unicode MS" w:eastAsia="Heiti SC" w:hAnsi="Heiti SC"/>
+                <w:b w:val="0"/>
+                <w:color w:val="233447"/>
+                <w:sz w:val="17"/>
+                <w:rtl w:val="0"/>
+              </w:rPr>
+              <w:t>记录Skill/Review版本；重新运行静态校验和独立Review。</w:t>
             </w:r>
           </w:p>
         </w:tc>
@@ -5034,13 +5054,13 @@
             </w:pPr>
             <w:r>
               <w:rPr>
-                <w:rFonts w:ascii="Arial Unicode MS" w:cs="Arial Unicode MS" w:eastAsia="Arial Unicode MS" w:hAnsi="Arial Unicode MS"/>
-                <w:b w:val="0"/>
-                <w:color w:val="233447"/>
-                <w:sz w:val="17"/>
-                <w:rtl w:val="0"/>
-              </w:rPr>
-              <w:t>Historical PASS does not automatically remain publishable.</w:t>
+                <w:rFonts w:ascii="Heiti SC" w:cs="Arial Unicode MS" w:eastAsia="Heiti SC" w:hAnsi="Heiti SC"/>
+                <w:b w:val="0"/>
+                <w:color w:val="233447"/>
+                <w:sz w:val="17"/>
+                <w:rtl w:val="0"/>
+              </w:rPr>
+              <w:t>历史PASS不会自动保持可发布。</w:t>
             </w:r>
           </w:p>
         </w:tc>
@@ -5070,10 +5090,10 @@
       </w:pPr>
       <w:r>
         <w:rPr>
-          <w:rFonts w:ascii="Arial Unicode MS" w:cs="Arial Unicode MS" w:eastAsia="Arial Unicode MS" w:hAnsi="Arial Unicode MS"/>
+          <w:rFonts w:ascii="Heiti SC" w:cs="Arial Unicode MS" w:eastAsia="Heiti SC" w:hAnsi="Heiti SC"/>
           <w:rtl w:val="0"/>
         </w:rPr>
-        <w:t>8.  Security and Privacy Considerations</w:t>
+        <w:t>8.  安全与隐私</w:t>
       </w:r>
     </w:p>
     <w:p>
@@ -5112,7 +5132,7 @@
       </w:pPr>
       <w:r>
         <w:rPr>
-          <w:rFonts w:ascii="Arial Unicode MS" w:cs="Arial Unicode MS" w:eastAsia="Arial Unicode MS" w:hAnsi="Arial Unicode MS"/>
+          <w:rFonts w:ascii="Heiti SC" w:cs="Arial Unicode MS" w:eastAsia="Heiti SC" w:hAnsi="Heiti SC"/>
           <w:i w:val="0"/>
           <w:iCs w:val="0"/>
           <w:smallCaps w:val="0"/>
@@ -5125,7 +5145,7 @@
           <w:vertAlign w:val="baseline"/>
           <w:rtl w:val="0"/>
         </w:rPr>
-        <w:t>• Read UNIPARSER_API_KEY from the environment only; never store it in the Skill, record, logs, or package.</w:t>
+        <w:t>• 只从环境读取UNIPARSER_API_KEY；不得写入Skill、记录、日志或题包。</w:t>
       </w:r>
     </w:p>
     <w:p>
@@ -5151,7 +5171,7 @@
       </w:pPr>
       <w:r>
         <w:rPr>
-          <w:rFonts w:ascii="Arial Unicode MS" w:cs="Arial Unicode MS" w:eastAsia="Arial Unicode MS" w:hAnsi="Arial Unicode MS"/>
+          <w:rFonts w:ascii="Heiti SC" w:cs="Arial Unicode MS" w:eastAsia="Heiti SC" w:hAnsi="Heiti SC"/>
           <w:i w:val="0"/>
           <w:iCs w:val="0"/>
           <w:smallCaps w:val="0"/>
@@ -5164,7 +5184,7 @@
           <w:vertAlign w:val="baseline"/>
           <w:rtl w:val="0"/>
         </w:rPr>
-        <w:t>• Do not record Authorization headers, pre-signed URLs, or reusable credentials; retain only task token and non-sensitive flags.</w:t>
+        <w:t>• 不记录Authorization header、预签名URL或可复用凭据；只保留任务token和非敏感解析参数。</w:t>
       </w:r>
     </w:p>
     <w:p>
@@ -5190,7 +5210,7 @@
       </w:pPr>
       <w:r>
         <w:rPr>
-          <w:rFonts w:ascii="Arial Unicode MS" w:cs="Arial Unicode MS" w:eastAsia="Arial Unicode MS" w:hAnsi="Arial Unicode MS"/>
+          <w:rFonts w:ascii="Heiti SC" w:cs="Arial Unicode MS" w:eastAsia="Heiti SC" w:hAnsi="Heiti SC"/>
           <w:i w:val="0"/>
           <w:iCs w:val="0"/>
           <w:smallCaps w:val="0"/>
@@ -5203,7 +5223,7 @@
           <w:vertAlign w:val="baseline"/>
           <w:rtl w:val="0"/>
         </w:rPr>
-        <w:t>• Paper PDF, parsed Markdown, hidden Gold, and references may have licensing constraints; check access, distribution, and retention separately.</w:t>
+        <w:t>• 论文PDF、解析Markdown、隐藏Gold和参考文件可能受许可约束；访问、分发和保留政策需要分别确认。</w:t>
       </w:r>
     </w:p>
     <w:p>
@@ -5229,7 +5249,7 @@
       </w:pPr>
       <w:r>
         <w:rPr>
-          <w:rFonts w:ascii="Arial Unicode MS" w:cs="Arial Unicode MS" w:eastAsia="Arial Unicode MS" w:hAnsi="Arial Unicode MS"/>
+          <w:rFonts w:ascii="Heiti SC" w:cs="Arial Unicode MS" w:eastAsia="Heiti SC" w:hAnsi="Heiti SC"/>
           <w:i w:val="0"/>
           <w:iCs w:val="0"/>
           <w:smallCaps w:val="0"/>
@@ -5242,7 +5262,7 @@
           <w:vertAlign w:val="baseline"/>
           <w:rtl w:val="0"/>
         </w:rPr>
-        <w:t>• Hidden Gold, exact tolerances, and checker implementation stay out of instruction; submission requirements remain fully public.</w:t>
+        <w:t>• 隐藏Gold、精确容差和checker实现不进入instruction；提交要求必须全部公开。</w:t>
       </w:r>
     </w:p>
     <w:p>
@@ -5267,7 +5287,10 @@
         </w:rPr>
       </w:pPr>
       <w:r>
-        <w:t>• Any solution path component is excluded recursively from Authoring, Review, and Repair; Harbor scaffolding must use --no-solution.</w:t>
+        <w:rPr>
+          <w:rFonts w:ascii="Heiti SC" w:hAnsi="Heiti SC" w:eastAsia="Heiti SC"/>
+        </w:rPr>
+        <w:t>• 任意层级的solution路径组件都从Authoring、Review和Repair中递归排除；Harbor脚手架必须使用--no-solution。</w:t>
       </w:r>
     </w:p>
     <w:p>
@@ -5353,10 +5376,10 @@
       </w:pPr>
       <w:r>
         <w:rPr>
-          <w:rFonts w:ascii="Arial Unicode MS" w:cs="Arial Unicode MS" w:eastAsia="Arial Unicode MS" w:hAnsi="Arial Unicode MS"/>
+          <w:rFonts w:ascii="Heiti SC" w:cs="Arial Unicode MS" w:eastAsia="Heiti SC" w:hAnsi="Heiti SC"/>
           <w:rtl w:val="0"/>
         </w:rPr>
-        <w:t>9.  Operational Readiness</w:t>
+        <w:t>9.  运行准备度</w:t>
       </w:r>
     </w:p>
     <w:tbl>
@@ -5420,14 +5443,14 @@
             </w:pPr>
             <w:r>
               <w:rPr>
-                <w:rFonts w:ascii="Arial Unicode MS" w:cs="Arial Unicode MS" w:eastAsia="Arial Unicode MS" w:hAnsi="Arial Unicode MS"/>
+                <w:rFonts w:ascii="Heiti SC" w:cs="Arial Unicode MS" w:eastAsia="Heiti SC" w:hAnsi="Heiti SC"/>
                 <w:b/>
                 <w:bCs w:val="1"/>
                 <w:color w:val="ffffff"/>
                 <w:sz w:val="17"/>
                 <w:rtl w:val="0"/>
               </w:rPr>
-              <w:t>Signal</w:t>
+              <w:t>信号</w:t>
             </w:r>
           </w:p>
         </w:tc>
@@ -5457,14 +5480,14 @@
             </w:pPr>
             <w:r>
               <w:rPr>
-                <w:rFonts w:ascii="Arial Unicode MS" w:cs="Arial Unicode MS" w:eastAsia="Arial Unicode MS" w:hAnsi="Arial Unicode MS"/>
+                <w:rFonts w:ascii="Heiti SC" w:cs="Arial Unicode MS" w:eastAsia="Heiti SC" w:hAnsi="Heiti SC"/>
                 <w:b/>
                 <w:bCs w:val="1"/>
                 <w:color w:val="ffffff"/>
                 <w:sz w:val="17"/>
                 <w:rtl w:val="0"/>
               </w:rPr>
-              <w:t>SLO or alert</w:t>
+              <w:t>SLO或告警</w:t>
             </w:r>
           </w:p>
         </w:tc>
@@ -5494,14 +5517,14 @@
             </w:pPr>
             <w:r>
               <w:rPr>
-                <w:rFonts w:ascii="Arial Unicode MS" w:cs="Arial Unicode MS" w:eastAsia="Arial Unicode MS" w:hAnsi="Arial Unicode MS"/>
+                <w:rFonts w:ascii="Heiti SC" w:cs="Arial Unicode MS" w:eastAsia="Heiti SC" w:hAnsi="Heiti SC"/>
                 <w:b/>
                 <w:bCs w:val="1"/>
                 <w:color w:val="ffffff"/>
                 <w:sz w:val="17"/>
                 <w:rtl w:val="0"/>
               </w:rPr>
-              <w:t>Owner</w:t>
+              <w:t>负责人</w:t>
             </w:r>
           </w:p>
         </w:tc>
@@ -5531,7 +5554,7 @@
             </w:pPr>
             <w:r>
               <w:rPr>
-                <w:rFonts w:ascii="Arial Unicode MS" w:cs="Arial Unicode MS" w:eastAsia="Arial Unicode MS" w:hAnsi="Arial Unicode MS"/>
+                <w:rFonts w:ascii="Heiti SC" w:cs="Arial Unicode MS" w:eastAsia="Heiti SC" w:hAnsi="Heiti SC"/>
                 <w:b/>
                 <w:bCs w:val="1"/>
                 <w:color w:val="ffffff"/>
@@ -5539,7 +5562,7 @@
                 <w:szCs w:val="16"/>
                 <w:rtl w:val="0"/>
               </w:rPr>
-              <w:t>Launch gate</w:t>
+              <w:t>发布门槛</w:t>
             </w:r>
           </w:p>
         </w:tc>
@@ -5575,13 +5598,13 @@
             </w:pPr>
             <w:r>
               <w:rPr>
-                <w:rFonts w:ascii="Arial Unicode MS" w:cs="Arial Unicode MS" w:eastAsia="Arial Unicode MS" w:hAnsi="Arial Unicode MS"/>
-                <w:b w:val="0"/>
-                <w:color w:val="233447"/>
-                <w:sz w:val="17"/>
-                <w:rtl w:val="0"/>
-              </w:rPr>
-              <w:t>Review first-pass enhanced rate</w:t>
+                <w:rFonts w:ascii="Heiti SC" w:cs="Arial Unicode MS" w:eastAsia="Heiti SC" w:hAnsi="Heiti SC"/>
+                <w:b w:val="0"/>
+                <w:color w:val="233447"/>
+                <w:sz w:val="17"/>
+                <w:rtl w:val="0"/>
+              </w:rPr>
+              <w:t>首次Review增强通过率</w:t>
             </w:r>
           </w:p>
         </w:tc>
@@ -5611,13 +5634,13 @@
             </w:pPr>
             <w:r>
               <w:rPr>
-                <w:rFonts w:ascii="Arial Unicode MS" w:cs="Arial Unicode MS" w:eastAsia="Arial Unicode MS" w:hAnsi="Arial Unicode MS"/>
-                <w:b w:val="0"/>
-                <w:color w:val="233447"/>
-                <w:sz w:val="17"/>
-                <w:rtl w:val="0"/>
-              </w:rPr>
-              <w:t>Pilot target at least 80%; every failure has a cited gate and evidence.</w:t>
+                <w:rFonts w:ascii="Heiti SC" w:cs="Arial Unicode MS" w:eastAsia="Heiti SC" w:hAnsi="Heiti SC"/>
+                <w:b w:val="0"/>
+                <w:color w:val="233447"/>
+                <w:sz w:val="17"/>
+                <w:rtl w:val="0"/>
+              </w:rPr>
+              <w:t>试点目标不低于80%；每个失败都带门禁和证据。</w:t>
             </w:r>
           </w:p>
         </w:tc>
@@ -5647,13 +5670,13 @@
             </w:pPr>
             <w:r>
               <w:rPr>
-                <w:rFonts w:ascii="Arial Unicode MS" w:cs="Arial Unicode MS" w:eastAsia="Arial Unicode MS" w:hAnsi="Arial Unicode MS"/>
-                <w:b w:val="0"/>
-                <w:color w:val="233447"/>
-                <w:sz w:val="17"/>
-                <w:rtl w:val="0"/>
-              </w:rPr>
-              <w:t>Authoring + independent Review</w:t>
+                <w:rFonts w:ascii="Heiti SC" w:cs="Arial Unicode MS" w:eastAsia="Heiti SC" w:hAnsi="Heiti SC"/>
+                <w:b w:val="0"/>
+                <w:color w:val="233447"/>
+                <w:sz w:val="17"/>
+                <w:rtl w:val="0"/>
+              </w:rPr>
+              <w:t>Authoring＋独立Review</w:t>
             </w:r>
           </w:p>
         </w:tc>
@@ -5685,14 +5708,14 @@
             </w:pPr>
             <w:r>
               <w:rPr>
-                <w:rFonts w:ascii="Arial Unicode MS" w:cs="Arial Unicode MS" w:eastAsia="Arial Unicode MS" w:hAnsi="Arial Unicode MS"/>
+                <w:rFonts w:ascii="Heiti SC" w:cs="Arial Unicode MS" w:eastAsia="Heiti SC" w:hAnsi="Heiti SC"/>
                 <w:b w:val="0"/>
                 <w:color w:val="233447"/>
                 <w:sz w:val="17"/>
                 <w:szCs w:val="16"/>
                 <w:rtl w:val="0"/>
               </w:rPr>
-              <w:t>Required</w:t>
+              <w:t>必需</w:t>
             </w:r>
           </w:p>
         </w:tc>
@@ -5728,13 +5751,13 @@
             </w:pPr>
             <w:r>
               <w:rPr>
-                <w:rFonts w:ascii="Arial Unicode MS" w:cs="Arial Unicode MS" w:eastAsia="Arial Unicode MS" w:hAnsi="Arial Unicode MS"/>
-                <w:b w:val="0"/>
-                <w:color w:val="233447"/>
-                <w:sz w:val="17"/>
-                <w:rtl w:val="0"/>
-              </w:rPr>
-              <w:t>Gold/condition/resource closure</w:t>
+                <w:rFonts w:ascii="Heiti SC" w:cs="Arial Unicode MS" w:eastAsia="Heiti SC" w:hAnsi="Heiti SC"/>
+                <w:b w:val="0"/>
+                <w:color w:val="233447"/>
+                <w:sz w:val="17"/>
+                <w:rtl w:val="0"/>
+              </w:rPr>
+              <w:t>Gold/条件/资源闭环</w:t>
             </w:r>
           </w:p>
         </w:tc>
@@ -5764,13 +5787,13 @@
             </w:pPr>
             <w:r>
               <w:rPr>
-                <w:rFonts w:ascii="Arial Unicode MS" w:cs="Arial Unicode MS" w:eastAsia="Arial Unicode MS" w:hAnsi="Arial Unicode MS"/>
-                <w:b w:val="0"/>
-                <w:color w:val="233447"/>
-                <w:sz w:val="17"/>
-                <w:rtl w:val="0"/>
-              </w:rPr>
-              <w:t>100% closed at review-ready; any dangling ID blocks.</w:t>
+                <w:rFonts w:ascii="Heiti SC" w:cs="Arial Unicode MS" w:eastAsia="Heiti SC" w:hAnsi="Heiti SC"/>
+                <w:b w:val="0"/>
+                <w:color w:val="233447"/>
+                <w:sz w:val="17"/>
+                <w:rtl w:val="0"/>
+              </w:rPr>
+              <w:t>review-ready阶段100%闭环；任意悬空ID都会阻塞。</w:t>
             </w:r>
           </w:p>
         </w:tc>
@@ -5800,7 +5823,7 @@
             </w:pPr>
             <w:r>
               <w:rPr>
-                <w:rFonts w:ascii="Arial Unicode MS" w:cs="Arial Unicode MS" w:eastAsia="Arial Unicode MS" w:hAnsi="Arial Unicode MS"/>
+                <w:rFonts w:ascii="Heiti SC" w:cs="Arial Unicode MS" w:eastAsia="Heiti SC" w:hAnsi="Heiti SC"/>
                 <w:b w:val="0"/>
                 <w:color w:val="233447"/>
                 <w:sz w:val="17"/>
@@ -5838,14 +5861,14 @@
             </w:pPr>
             <w:r>
               <w:rPr>
-                <w:rFonts w:ascii="Arial Unicode MS" w:cs="Arial Unicode MS" w:eastAsia="Arial Unicode MS" w:hAnsi="Arial Unicode MS"/>
+                <w:rFonts w:ascii="Heiti SC" w:cs="Arial Unicode MS" w:eastAsia="Heiti SC" w:hAnsi="Heiti SC"/>
                 <w:b w:val="0"/>
                 <w:color w:val="233447"/>
                 <w:sz w:val="17"/>
                 <w:szCs w:val="16"/>
                 <w:rtl w:val="0"/>
               </w:rPr>
-              <w:t>Required</w:t>
+              <w:t>必需</w:t>
             </w:r>
           </w:p>
         </w:tc>
@@ -5881,13 +5904,13 @@
             </w:pPr>
             <w:r>
               <w:rPr>
-                <w:rFonts w:ascii="Arial Unicode MS" w:cs="Arial Unicode MS" w:eastAsia="Arial Unicode MS" w:hAnsi="Arial Unicode MS"/>
-                <w:b w:val="0"/>
-                <w:color w:val="233447"/>
-                <w:sz w:val="17"/>
-                <w:rtl w:val="0"/>
-              </w:rPr>
-              <w:t>Checker correctness probes</w:t>
+                <w:rFonts w:ascii="Heiti SC" w:cs="Arial Unicode MS" w:eastAsia="Heiti SC" w:hAnsi="Heiti SC"/>
+                <w:b w:val="0"/>
+                <w:color w:val="233447"/>
+                <w:sz w:val="17"/>
+                <w:rtl w:val="0"/>
+              </w:rPr>
+              <w:t>Checker正确性探针</w:t>
             </w:r>
           </w:p>
         </w:tc>
@@ -5917,13 +5940,13 @@
             </w:pPr>
             <w:r>
               <w:rPr>
-                <w:rFonts w:ascii="Arial Unicode MS" w:cs="Arial Unicode MS" w:eastAsia="Arial Unicode MS" w:hAnsi="Arial Unicode MS"/>
-                <w:b w:val="0"/>
-                <w:color w:val="233447"/>
-                <w:sz w:val="17"/>
-                <w:rtl w:val="0"/>
-              </w:rPr>
-              <w:t>Five Baseline plus at least one enhanced probe pass; retain per-component reward.</w:t>
+                <w:rFonts w:ascii="Heiti SC" w:cs="Arial Unicode MS" w:eastAsia="Heiti SC" w:hAnsi="Heiti SC"/>
+                <w:b w:val="0"/>
+                <w:color w:val="233447"/>
+                <w:sz w:val="17"/>
+                <w:rtl w:val="0"/>
+              </w:rPr>
+              <w:t>5个Baseline加至少1个enhanced probe通过；保留分项reward。</w:t>
             </w:r>
           </w:p>
         </w:tc>
@@ -5953,13 +5976,13 @@
             </w:pPr>
             <w:r>
               <w:rPr>
-                <w:rFonts w:ascii="Arial Unicode MS" w:cs="Arial Unicode MS" w:eastAsia="Arial Unicode MS" w:hAnsi="Arial Unicode MS"/>
-                <w:b w:val="0"/>
-                <w:color w:val="233447"/>
-                <w:sz w:val="17"/>
-                <w:rtl w:val="0"/>
-              </w:rPr>
-              <w:t>Checker author</w:t>
+                <w:rFonts w:ascii="Heiti SC" w:cs="Arial Unicode MS" w:eastAsia="Heiti SC" w:hAnsi="Heiti SC"/>
+                <w:b w:val="0"/>
+                <w:color w:val="233447"/>
+                <w:sz w:val="17"/>
+                <w:rtl w:val="0"/>
+              </w:rPr>
+              <w:t>Checker作者</w:t>
             </w:r>
           </w:p>
         </w:tc>
@@ -5991,14 +6014,14 @@
             </w:pPr>
             <w:r>
               <w:rPr>
-                <w:rFonts w:ascii="Arial Unicode MS" w:cs="Arial Unicode MS" w:eastAsia="Arial Unicode MS" w:hAnsi="Arial Unicode MS"/>
+                <w:rFonts w:ascii="Heiti SC" w:cs="Arial Unicode MS" w:eastAsia="Heiti SC" w:hAnsi="Heiti SC"/>
                 <w:b w:val="0"/>
                 <w:color w:val="233447"/>
                 <w:sz w:val="17"/>
                 <w:szCs w:val="16"/>
                 <w:rtl w:val="0"/>
               </w:rPr>
-              <w:t>Required</w:t>
+              <w:t>必需</w:t>
             </w:r>
           </w:p>
         </w:tc>
@@ -6034,13 +6057,13 @@
             </w:pPr>
             <w:r>
               <w:rPr>
-                <w:rFonts w:ascii="Arial Unicode MS" w:cs="Arial Unicode MS" w:eastAsia="Arial Unicode MS" w:hAnsi="Arial Unicode MS"/>
-                <w:b w:val="0"/>
-                <w:color w:val="233447"/>
-                <w:sz w:val="17"/>
-                <w:rtl w:val="0"/>
-              </w:rPr>
-              <w:t>Checker cost</w:t>
+                <w:rFonts w:ascii="Heiti SC" w:cs="Arial Unicode MS" w:eastAsia="Heiti SC" w:hAnsi="Heiti SC"/>
+                <w:b w:val="0"/>
+                <w:color w:val="233447"/>
+                <w:sz w:val="17"/>
+                <w:rtl w:val="0"/>
+              </w:rPr>
+              <w:t>Checker成本</w:t>
             </w:r>
           </w:p>
         </w:tc>
@@ -6070,13 +6093,13 @@
             </w:pPr>
             <w:r>
               <w:rPr>
-                <w:rFonts w:ascii="Arial Unicode MS" w:cs="Arial Unicode MS" w:eastAsia="Arial Unicode MS" w:hAnsi="Arial Unicode MS"/>
-                <w:b w:val="0"/>
-                <w:color w:val="233447"/>
-                <w:sz w:val="17"/>
-                <w:rtl w:val="0"/>
-              </w:rPr>
-              <w:t>At most 32 CPU or 1 H100 and 600 s; real-scale; no primary recomputation.</w:t>
+                <w:rFonts w:ascii="Heiti SC" w:cs="Arial Unicode MS" w:eastAsia="Heiti SC" w:hAnsi="Heiti SC"/>
+                <w:b w:val="0"/>
+                <w:color w:val="233447"/>
+                <w:sz w:val="17"/>
+                <w:rtl w:val="0"/>
+              </w:rPr>
+              <w:t>最多32核CPU或单卡H100、600秒；真实规模；不重算主要科学过程。</w:t>
             </w:r>
           </w:p>
         </w:tc>
@@ -6106,13 +6129,13 @@
             </w:pPr>
             <w:r>
               <w:rPr>
-                <w:rFonts w:ascii="Arial Unicode MS" w:cs="Arial Unicode MS" w:eastAsia="Arial Unicode MS" w:hAnsi="Arial Unicode MS"/>
-                <w:b w:val="0"/>
-                <w:color w:val="233447"/>
-                <w:sz w:val="17"/>
-                <w:rtl w:val="0"/>
-              </w:rPr>
-              <w:t>Review operational gate</w:t>
+                <w:rFonts w:ascii="Heiti SC" w:cs="Arial Unicode MS" w:eastAsia="Heiti SC" w:hAnsi="Heiti SC"/>
+                <w:b w:val="0"/>
+                <w:color w:val="233447"/>
+                <w:sz w:val="17"/>
+                <w:rtl w:val="0"/>
+              </w:rPr>
+              <w:t>Review运行门禁</w:t>
             </w:r>
           </w:p>
         </w:tc>
@@ -6144,14 +6167,14 @@
             </w:pPr>
             <w:r>
               <w:rPr>
-                <w:rFonts w:ascii="Arial Unicode MS" w:cs="Arial Unicode MS" w:eastAsia="Arial Unicode MS" w:hAnsi="Arial Unicode MS"/>
+                <w:rFonts w:ascii="Heiti SC" w:cs="Arial Unicode MS" w:eastAsia="Heiti SC" w:hAnsi="Heiti SC"/>
                 <w:b w:val="0"/>
                 <w:color w:val="233447"/>
                 <w:sz w:val="17"/>
                 <w:szCs w:val="16"/>
                 <w:rtl w:val="0"/>
               </w:rPr>
-              <w:t>Required</w:t>
+              <w:t>必需</w:t>
             </w:r>
           </w:p>
         </w:tc>
@@ -6187,13 +6210,13 @@
             </w:pPr>
             <w:r>
               <w:rPr>
-                <w:rFonts w:ascii="Arial Unicode MS" w:cs="Arial Unicode MS" w:eastAsia="Arial Unicode MS" w:hAnsi="Arial Unicode MS"/>
-                <w:b w:val="0"/>
-                <w:color w:val="233447"/>
-                <w:sz w:val="17"/>
-                <w:rtl w:val="0"/>
-              </w:rPr>
-              <w:t>UniParser quality</w:t>
+                <w:rFonts w:ascii="Heiti SC" w:cs="Arial Unicode MS" w:eastAsia="Heiti SC" w:hAnsi="Heiti SC"/>
+                <w:b w:val="0"/>
+                <w:color w:val="233447"/>
+                <w:sz w:val="17"/>
+                <w:rtl w:val="0"/>
+              </w:rPr>
+              <w:t>UniParser质量</w:t>
             </w:r>
           </w:p>
         </w:tc>
@@ -6223,13 +6246,13 @@
             </w:pPr>
             <w:r>
               <w:rPr>
-                <w:rFonts w:ascii="Arial Unicode MS" w:cs="Arial Unicode MS" w:eastAsia="Arial Unicode MS" w:hAnsi="Arial Unicode MS"/>
-                <w:b w:val="0"/>
-                <w:color w:val="233447"/>
-                <w:sz w:val="17"/>
-                <w:rtl w:val="0"/>
-              </w:rPr>
-              <w:t>Load-bearing text/equation/table/caption all PASS; otherwise reparse or block.</w:t>
+                <w:rFonts w:ascii="Heiti SC" w:cs="Arial Unicode MS" w:eastAsia="Heiti SC" w:hAnsi="Heiti SC"/>
+                <w:b w:val="0"/>
+                <w:color w:val="233447"/>
+                <w:sz w:val="17"/>
+                <w:rtl w:val="0"/>
+              </w:rPr>
+              <w:t>关键文本/公式/表格/图注全部PASS；否则重解析或阻塞。</w:t>
             </w:r>
           </w:p>
         </w:tc>
@@ -6259,13 +6282,13 @@
             </w:pPr>
             <w:r>
               <w:rPr>
-                <w:rFonts w:ascii="Arial Unicode MS" w:cs="Arial Unicode MS" w:eastAsia="Arial Unicode MS" w:hAnsi="Arial Unicode MS"/>
-                <w:b w:val="0"/>
-                <w:color w:val="233447"/>
-                <w:sz w:val="17"/>
-                <w:rtl w:val="0"/>
-              </w:rPr>
-              <w:t>Source/parse owner</w:t>
+                <w:rFonts w:ascii="Heiti SC" w:cs="Arial Unicode MS" w:eastAsia="Heiti SC" w:hAnsi="Heiti SC"/>
+                <w:b w:val="0"/>
+                <w:color w:val="233447"/>
+                <w:sz w:val="17"/>
+                <w:rtl w:val="0"/>
+              </w:rPr>
+              <w:t>源文件/解析负责人</w:t>
             </w:r>
           </w:p>
         </w:tc>
@@ -6297,14 +6320,14 @@
             </w:pPr>
             <w:r>
               <w:rPr>
-                <w:rFonts w:ascii="Arial Unicode MS" w:cs="Arial Unicode MS" w:eastAsia="Arial Unicode MS" w:hAnsi="Arial Unicode MS"/>
+                <w:rFonts w:ascii="Heiti SC" w:cs="Arial Unicode MS" w:eastAsia="Heiti SC" w:hAnsi="Heiti SC"/>
                 <w:b w:val="0"/>
                 <w:color w:val="233447"/>
                 <w:sz w:val="17"/>
                 <w:szCs w:val="16"/>
                 <w:rtl w:val="0"/>
               </w:rPr>
-              <w:t>Required</w:t>
+              <w:t>必需</w:t>
             </w:r>
           </w:p>
         </w:tc>
@@ -6341,7 +6364,7 @@
             </w:pPr>
             <w:r>
               <w:rPr>
-                <w:rFonts w:ascii="Arial Unicode MS" w:cs="Arial Unicode MS" w:eastAsia="Arial Unicode MS" w:hAnsi="Arial Unicode MS"/>
+                <w:rFonts w:ascii="Heiti SC" w:cs="Arial Unicode MS" w:eastAsia="Heiti SC" w:hAnsi="Heiti SC"/>
                 <w:b w:val="0"/>
                 <w:color w:val="082a4a"/>
                 <w:sz w:val="17"/>
@@ -6376,10 +6399,10 @@
       </w:pPr>
       <w:r>
         <w:rPr>
-          <w:rFonts w:ascii="Arial Unicode MS" w:cs="Arial Unicode MS" w:eastAsia="Arial Unicode MS" w:hAnsi="Arial Unicode MS"/>
+          <w:rFonts w:ascii="Heiti SC" w:cs="Arial Unicode MS" w:eastAsia="Heiti SC" w:hAnsi="Heiti SC"/>
           <w:rtl w:val="0"/>
         </w:rPr>
-        <w:t>10.  Alternatives Considered</w:t>
+        <w:t>10.  备选方案</w:t>
       </w:r>
     </w:p>
     <w:p>
@@ -6467,14 +6490,14 @@
             </w:pPr>
             <w:r>
               <w:rPr>
-                <w:rFonts w:ascii="Arial Unicode MS" w:cs="Arial Unicode MS" w:eastAsia="Arial Unicode MS" w:hAnsi="Arial Unicode MS"/>
+                <w:rFonts w:ascii="Heiti SC" w:cs="Arial Unicode MS" w:eastAsia="Heiti SC" w:hAnsi="Heiti SC"/>
                 <w:b/>
                 <w:bCs w:val="1"/>
                 <w:color w:val="ffffff"/>
                 <w:sz w:val="17"/>
                 <w:rtl w:val="0"/>
               </w:rPr>
-              <w:t>Alternative</w:t>
+              <w:t>备选方案</w:t>
             </w:r>
           </w:p>
         </w:tc>
@@ -6504,14 +6527,14 @@
             </w:pPr>
             <w:r>
               <w:rPr>
-                <w:rFonts w:ascii="Arial Unicode MS" w:cs="Arial Unicode MS" w:eastAsia="Arial Unicode MS" w:hAnsi="Arial Unicode MS"/>
+                <w:rFonts w:ascii="Heiti SC" w:cs="Arial Unicode MS" w:eastAsia="Heiti SC" w:hAnsi="Heiti SC"/>
                 <w:b/>
                 <w:bCs w:val="1"/>
                 <w:color w:val="ffffff"/>
                 <w:sz w:val="17"/>
                 <w:rtl w:val="0"/>
               </w:rPr>
-              <w:t>Why it was considered</w:t>
+              <w:t>考虑原因</w:t>
             </w:r>
           </w:p>
         </w:tc>
@@ -6541,14 +6564,14 @@
             </w:pPr>
             <w:r>
               <w:rPr>
-                <w:rFonts w:ascii="Arial Unicode MS" w:cs="Arial Unicode MS" w:eastAsia="Arial Unicode MS" w:hAnsi="Arial Unicode MS"/>
+                <w:rFonts w:ascii="Heiti SC" w:cs="Arial Unicode MS" w:eastAsia="Heiti SC" w:hAnsi="Heiti SC"/>
                 <w:b/>
                 <w:bCs w:val="1"/>
                 <w:color w:val="ffffff"/>
                 <w:sz w:val="17"/>
                 <w:rtl w:val="0"/>
               </w:rPr>
-              <w:t>Why it was not selected</w:t>
+              <w:t>未采用原因</w:t>
             </w:r>
           </w:p>
         </w:tc>
@@ -6584,13 +6607,13 @@
             </w:pPr>
             <w:r>
               <w:rPr>
-                <w:rFonts w:ascii="Arial Unicode MS" w:cs="Arial Unicode MS" w:eastAsia="Arial Unicode MS" w:hAnsi="Arial Unicode MS"/>
-                <w:b w:val="0"/>
-                <w:color w:val="233447"/>
-                <w:sz w:val="17"/>
-                <w:rtl w:val="0"/>
-              </w:rPr>
-              <w:t>One-shot LLM: PDF to full package</w:t>
+                <w:rFonts w:ascii="Heiti SC" w:cs="Arial Unicode MS" w:eastAsia="Heiti SC" w:hAnsi="Heiti SC"/>
+                <w:b w:val="0"/>
+                <w:color w:val="233447"/>
+                <w:sz w:val="17"/>
+                <w:rtl w:val="0"/>
+              </w:rPr>
+              <w:t>单次LLM：从PDF直接生成完整题包</w:t>
             </w:r>
           </w:p>
         </w:tc>
@@ -6620,13 +6643,13 @@
             </w:pPr>
             <w:r>
               <w:rPr>
-                <w:rFonts w:ascii="Arial Unicode MS" w:cs="Arial Unicode MS" w:eastAsia="Arial Unicode MS" w:hAnsi="Arial Unicode MS"/>
-                <w:b w:val="0"/>
-                <w:color w:val="233447"/>
-                <w:sz w:val="17"/>
-                <w:rtl w:val="0"/>
-              </w:rPr>
-              <w:t>Fast and low-call-count.</w:t>
+                <w:rFonts w:ascii="Heiti SC" w:cs="Arial Unicode MS" w:eastAsia="Heiti SC" w:hAnsi="Heiti SC"/>
+                <w:b w:val="0"/>
+                <w:color w:val="233447"/>
+                <w:sz w:val="17"/>
+                <w:rtl w:val="0"/>
+              </w:rPr>
+              <w:t>速度快、调用少。</w:t>
             </w:r>
           </w:p>
         </w:tc>
@@ -6656,13 +6679,13 @@
             </w:pPr>
             <w:r>
               <w:rPr>
-                <w:rFonts w:ascii="Arial Unicode MS" w:cs="Arial Unicode MS" w:eastAsia="Arial Unicode MS" w:hAnsi="Arial Unicode MS"/>
-                <w:b w:val="0"/>
-                <w:color w:val="233447"/>
-                <w:sz w:val="17"/>
-                <w:rtl w:val="0"/>
-              </w:rPr>
-              <w:t>Gold, conditions, resources, and checker are generated together, so errors can self-certify and are hard to localize.</w:t>
+                <w:rFonts w:ascii="Heiti SC" w:cs="Arial Unicode MS" w:eastAsia="Heiti SC" w:hAnsi="Heiti SC"/>
+                <w:b w:val="0"/>
+                <w:color w:val="233447"/>
+                <w:sz w:val="17"/>
+                <w:rtl w:val="0"/>
+              </w:rPr>
+              <w:t>Gold、条件、资源和checker同时生成，错误容易自证且难以定位。</w:t>
             </w:r>
           </w:p>
         </w:tc>
@@ -6698,13 +6721,13 @@
             </w:pPr>
             <w:r>
               <w:rPr>
-                <w:rFonts w:ascii="Arial Unicode MS" w:cs="Arial Unicode MS" w:eastAsia="Arial Unicode MS" w:hAnsi="Arial Unicode MS"/>
-                <w:b w:val="0"/>
-                <w:color w:val="233447"/>
-                <w:sz w:val="17"/>
-                <w:rtl w:val="0"/>
-              </w:rPr>
-              <w:t>Author Baseline, then route everything to Repair</w:t>
+                <w:rFonts w:ascii="Heiti SC" w:cs="Arial Unicode MS" w:eastAsia="Heiti SC" w:hAnsi="Heiti SC"/>
+                <w:b w:val="0"/>
+                <w:color w:val="233447"/>
+                <w:sz w:val="17"/>
+                <w:rtl w:val="0"/>
+              </w:rPr>
+              <w:t>先写Baseline，再把所有问题交给Repair</w:t>
             </w:r>
           </w:p>
         </w:tc>
@@ -6734,13 +6757,13 @@
             </w:pPr>
             <w:r>
               <w:rPr>
-                <w:rFonts w:ascii="Arial Unicode MS" w:cs="Arial Unicode MS" w:eastAsia="Arial Unicode MS" w:hAnsi="Arial Unicode MS"/>
-                <w:b w:val="0"/>
-                <w:color w:val="233447"/>
-                <w:sz w:val="17"/>
-                <w:rtl w:val="0"/>
-              </w:rPr>
-              <w:t>Reuses existing Repair capability.</w:t>
+                <w:rFonts w:ascii="Heiti SC" w:cs="Arial Unicode MS" w:eastAsia="Heiti SC" w:hAnsi="Heiti SC"/>
+                <w:b w:val="0"/>
+                <w:color w:val="233447"/>
+                <w:sz w:val="17"/>
+                <w:rtl w:val="0"/>
+              </w:rPr>
+              <w:t>复用现有Repair能力。</w:t>
             </w:r>
           </w:p>
         </w:tc>
@@ -6770,13 +6793,13 @@
             </w:pPr>
             <w:r>
               <w:rPr>
-                <w:rFonts w:ascii="Arial Unicode MS" w:cs="Arial Unicode MS" w:eastAsia="Arial Unicode MS" w:hAnsi="Arial Unicode MS"/>
-                <w:b w:val="0"/>
-                <w:color w:val="233447"/>
-                <w:sz w:val="17"/>
-                <w:rtl w:val="0"/>
-              </w:rPr>
-              <w:t>Contradicts the goal of reducing Repair and exposes defects only after package generation.</w:t>
+                <w:rFonts w:ascii="Heiti SC" w:cs="Arial Unicode MS" w:eastAsia="Heiti SC" w:hAnsi="Heiti SC"/>
+                <w:b w:val="0"/>
+                <w:color w:val="233447"/>
+                <w:sz w:val="17"/>
+                <w:rtl w:val="0"/>
+              </w:rPr>
+              <w:t>违背减少Repair的目标，而且题包生成后才暴露缺陷。</w:t>
             </w:r>
           </w:p>
         </w:tc>
@@ -6812,13 +6835,13 @@
             </w:pPr>
             <w:r>
               <w:rPr>
-                <w:rFonts w:ascii="Arial Unicode MS" w:cs="Arial Unicode MS" w:eastAsia="Arial Unicode MS" w:hAnsi="Arial Unicode MS"/>
-                <w:b w:val="0"/>
-                <w:color w:val="233447"/>
-                <w:sz w:val="17"/>
-                <w:rtl w:val="0"/>
-              </w:rPr>
-              <w:t>Hard-code /app/resources paths in instruction</w:t>
+                <w:rFonts w:ascii="Heiti SC" w:cs="Arial Unicode MS" w:eastAsia="Heiti SC" w:hAnsi="Heiti SC"/>
+                <w:b w:val="0"/>
+                <w:color w:val="233447"/>
+                <w:sz w:val="17"/>
+                <w:rtl w:val="0"/>
+              </w:rPr>
+              <w:t>在instruction中硬编码/app/resources路径</w:t>
             </w:r>
           </w:p>
         </w:tc>
@@ -6848,13 +6871,13 @@
             </w:pPr>
             <w:r>
               <w:rPr>
-                <w:rFonts w:ascii="Arial Unicode MS" w:cs="Arial Unicode MS" w:eastAsia="Arial Unicode MS" w:hAnsi="Arial Unicode MS"/>
-                <w:b w:val="0"/>
-                <w:color w:val="233447"/>
-                <w:sz w:val="17"/>
-                <w:rtl w:val="0"/>
-              </w:rPr>
-              <w:t>Direct in-container convention.</w:t>
+                <w:rFonts w:ascii="Heiti SC" w:cs="Arial Unicode MS" w:eastAsia="Heiti SC" w:hAnsi="Heiti SC"/>
+                <w:b w:val="0"/>
+                <w:color w:val="233447"/>
+                <w:sz w:val="17"/>
+                <w:rtl w:val="0"/>
+              </w:rPr>
+              <w:t>容器内约定直接。</w:t>
             </w:r>
           </w:p>
         </w:tc>
@@ -6884,13 +6907,13 @@
             </w:pPr>
             <w:r>
               <w:rPr>
-                <w:rFonts w:ascii="Arial Unicode MS" w:cs="Arial Unicode MS" w:eastAsia="Arial Unicode MS" w:hAnsi="Arial Unicode MS"/>
-                <w:b w:val="0"/>
-                <w:color w:val="233447"/>
-                <w:sz w:val="17"/>
-                <w:rtl w:val="0"/>
-              </w:rPr>
-              <w:t>Couples the scientific prompt to Playground, Bohrium, and local mount details.</w:t>
+                <w:rFonts w:ascii="Heiti SC" w:cs="Arial Unicode MS" w:eastAsia="Heiti SC" w:hAnsi="Heiti SC"/>
+                <w:b w:val="0"/>
+                <w:color w:val="233447"/>
+                <w:sz w:val="17"/>
+                <w:rtl w:val="0"/>
+              </w:rPr>
+              <w:t>把科学题面耦合到Playground、Bohrium和本地挂载细节。</w:t>
             </w:r>
           </w:p>
         </w:tc>
@@ -6926,13 +6949,13 @@
             </w:pPr>
             <w:r>
               <w:rPr>
-                <w:rFonts w:ascii="Arial Unicode MS" w:cs="Arial Unicode MS" w:eastAsia="Arial Unicode MS" w:hAnsi="Arial Unicode MS"/>
-                <w:b w:val="0"/>
-                <w:color w:val="233447"/>
-                <w:sz w:val="17"/>
-                <w:rtl w:val="0"/>
-              </w:rPr>
-              <w:t>Rerun the full primary computation in checker</w:t>
+                <w:rFonts w:ascii="Heiti SC" w:cs="Arial Unicode MS" w:eastAsia="Heiti SC" w:hAnsi="Heiti SC"/>
+                <w:b w:val="0"/>
+                <w:color w:val="233447"/>
+                <w:sz w:val="17"/>
+                <w:rtl w:val="0"/>
+              </w:rPr>
+              <w:t>在checker中重跑完整主要计算</w:t>
             </w:r>
           </w:p>
         </w:tc>
@@ -6962,13 +6985,13 @@
             </w:pPr>
             <w:r>
               <w:rPr>
-                <w:rFonts w:ascii="Arial Unicode MS" w:cs="Arial Unicode MS" w:eastAsia="Arial Unicode MS" w:hAnsi="Arial Unicode MS"/>
-                <w:b w:val="0"/>
-                <w:color w:val="233447"/>
-                <w:sz w:val="17"/>
-                <w:rtl w:val="0"/>
-              </w:rPr>
-              <w:t>Appears hardest to game.</w:t>
+                <w:rFonts w:ascii="Heiti SC" w:cs="Arial Unicode MS" w:eastAsia="Heiti SC" w:hAnsi="Heiti SC"/>
+                <w:b w:val="0"/>
+                <w:color w:val="233447"/>
+                <w:sz w:val="17"/>
+                <w:rtl w:val="0"/>
+              </w:rPr>
+              <w:t>表面上最难被绕过。</w:t>
             </w:r>
           </w:p>
         </w:tc>
@@ -6998,13 +7021,13 @@
             </w:pPr>
             <w:r>
               <w:rPr>
-                <w:rFonts w:ascii="Arial Unicode MS" w:cs="Arial Unicode MS" w:eastAsia="Arial Unicode MS" w:hAnsi="Arial Unicode MS"/>
-                <w:b w:val="0"/>
-                <w:color w:val="233447"/>
-                <w:sz w:val="17"/>
-                <w:rtl w:val="0"/>
-              </w:rPr>
-              <w:t>Exceeds cost budgets; prefer result invariants and offline references over duplicate solving.</w:t>
+                <w:rFonts w:ascii="Heiti SC" w:cs="Arial Unicode MS" w:eastAsia="Heiti SC" w:hAnsi="Heiti SC"/>
+                <w:b w:val="0"/>
+                <w:color w:val="233447"/>
+                <w:sz w:val="17"/>
+                <w:rtl w:val="0"/>
+              </w:rPr>
+              <w:t>超出成本预算；应优先使用结果不变量和离线reference。</w:t>
             </w:r>
           </w:p>
         </w:tc>
@@ -7034,10 +7057,10 @@
       </w:pPr>
       <w:r>
         <w:rPr>
-          <w:rFonts w:ascii="Arial Unicode MS" w:cs="Arial Unicode MS" w:eastAsia="Arial Unicode MS" w:hAnsi="Arial Unicode MS"/>
+          <w:rFonts w:ascii="Heiti SC" w:cs="Arial Unicode MS" w:eastAsia="Heiti SC" w:hAnsi="Heiti SC"/>
           <w:rtl w:val="0"/>
         </w:rPr>
-        <w:t>11.  Open Questions</w:t>
+        <w:t>11.  待决问题</w:t>
       </w:r>
     </w:p>
     <w:p>
@@ -7063,7 +7086,7 @@
       </w:pPr>
       <w:r>
         <w:rPr>
-          <w:rFonts w:ascii="Arial Unicode MS" w:cs="Arial Unicode MS" w:eastAsia="Arial Unicode MS" w:hAnsi="Arial Unicode MS"/>
+          <w:rFonts w:ascii="Heiti SC" w:cs="Arial Unicode MS" w:eastAsia="Heiti SC" w:hAnsi="Heiti SC"/>
           <w:i w:val="0"/>
           <w:iCs w:val="0"/>
           <w:smallCaps w:val="0"/>
@@ -7076,7 +7099,7 @@
           <w:vertAlign w:val="baseline"/>
           <w:rtl w:val="0"/>
         </w:rPr>
-        <w:t>1. Should new tasks publish into material_v3_question or a new authoring-generated corpus? Recommendation: keep them in independent processing until a human decides.</w:t>
+        <w:t>1. 新题应发布到material_v3_question，还是单独的Authoring生成语料？建议：先保留在独立processing中，等待人工决定。</w:t>
       </w:r>
     </w:p>
     <w:p>
@@ -7107,10 +7130,10 @@
       </w:pPr>
       <w:r>
         <w:rPr>
-          <w:rFonts w:ascii="Arial Unicode MS" w:hAnsi="Arial Unicode MS"/>
+          <w:rFonts w:ascii="Heiti SC" w:hAnsi="Heiti SC" w:eastAsia="Heiti SC"/>
           <w:sz w:val="19"/>
         </w:rPr>
-        <w:t>2. Who owns resource_unique_key to Playground/Trisol ID deployment mapping? Recommendation: authors declare stable identity; deployers add locator.</w:t>
+        <w:t>2. 谁负责resource_unique_key到Playground/Trisol ID的部署映射？建议：作者声明稳定科学身份，部署者补locator。</w:t>
       </w:r>
     </w:p>
     <w:p>
@@ -7141,10 +7164,10 @@
       </w:pPr>
       <w:r>
         <w:rPr>
-          <w:rFonts w:ascii="Arial Unicode MS" w:hAnsi="Arial Unicode MS"/>
+          <w:rFonts w:ascii="Heiti SC" w:hAnsi="Heiti SC" w:eastAsia="Heiti SC"/>
           <w:sz w:val="19"/>
         </w:rPr>
-        <w:t>3. When should the Paper2Arm schema 1.3 profile migrate to Harbor 1.4? Recommendation: retain the corpus profile and use harbor check for drift detection.</w:t>
+        <w:t>3. Paper2Arm schema 1.3何时迁移到Harbor 1.4？建议：当前保留语料profile，并用harbor check发现漂移。</w:t>
       </w:r>
     </w:p>
     <w:p>
@@ -7175,10 +7198,10 @@
       </w:pPr>
       <w:r>
         <w:rPr>
-          <w:rFonts w:ascii="Arial Unicode MS" w:hAnsi="Arial Unicode MS"/>
+          <w:rFonts w:ascii="Heiti SC" w:hAnsi="Heiti SC" w:eastAsia="Heiti SC"/>
           <w:sz w:val="19"/>
         </w:rPr>
-        <w:t>4. Figure-digitized Gold needs a separate policy for allowed tools, dual review, and uncertainty recording; until then unauditable figure values cannot be PAPER_DIRECT.</w:t>
+        <w:t>4. 从图中数字化得到的Gold需要单独规定允许工具、双人复审和不确定度记录；在此之前，无法审计的图中数值不能标为PAPER_DIRECT。</w:t>
       </w:r>
     </w:p>
     <w:p>
@@ -7206,10 +7229,10 @@
       </w:pPr>
       <w:r>
         <w:rPr>
-          <w:rFonts w:ascii="Arial Unicode MS" w:cs="Arial Unicode MS" w:eastAsia="Arial Unicode MS" w:hAnsi="Arial Unicode MS"/>
+          <w:rFonts w:ascii="Heiti SC" w:cs="Arial Unicode MS" w:eastAsia="Heiti SC" w:hAnsi="Heiti SC"/>
           <w:rtl w:val="0"/>
         </w:rPr>
-        <w:t>12.  Decision and Next Steps</w:t>
+        <w:t>12.  决策与后续</w:t>
       </w:r>
     </w:p>
     <w:p>
@@ -7221,7 +7244,10 @@
         </w:rPr>
       </w:pPr>
       <w:r>
-        <w:t>Adopt the evidence-backed compiler architecture and use `.cursor/skills/materials-benchmark-authoring/` as the M1 implementation. The initial version includes the workflow, references, solution-free template, authoring record, package validator, and positive/negative contract tests. Publish requires a complete Review 3.3 artifact, package-aware consistency, canonical output paths, closed resources, and a checker within the CPU/single-H100 budget. The next priority is forward-testing real papers across task types, measuring first-pass Review performance, and tightening gates exposed by failures.</w:t>
+        <w:rPr>
+          <w:rFonts w:ascii="Heiti SC" w:hAnsi="Heiti SC" w:eastAsia="Heiti SC"/>
+        </w:rPr>
+        <w:t>采用有证据约束的编译器架构，并以`.cursor/skills/materials-benchmark-authoring/`作为M1实现。当前版本包含Workflow、references、solution-free模板、authoring record、package validator和正反合同测试。发布必须具备完整Review 3.3 artifact、题包级一致性、规范输出路径、资源闭环，以及不超过32核CPU或单卡H100与600秒预算的checker。下一步是用不同任务类型的真实论文做前向测试，统计首次Review通过率，并针对实际失败继续收紧门槛。</w:t>
       </w:r>
     </w:p>
     <w:tbl>
@@ -7283,14 +7309,14 @@
             </w:pPr>
             <w:r>
               <w:rPr>
-                <w:rFonts w:ascii="Arial Unicode MS" w:cs="Arial Unicode MS" w:eastAsia="Arial Unicode MS" w:hAnsi="Arial Unicode MS"/>
+                <w:rFonts w:ascii="Heiti SC" w:cs="Arial Unicode MS" w:eastAsia="Heiti SC" w:hAnsi="Heiti SC"/>
                 <w:b/>
                 <w:bCs w:val="1"/>
                 <w:color w:val="ffffff"/>
                 <w:sz w:val="17"/>
                 <w:rtl w:val="0"/>
               </w:rPr>
-              <w:t>Milestone</w:t>
+              <w:t>里程碑</w:t>
             </w:r>
           </w:p>
         </w:tc>
@@ -7320,14 +7346,14 @@
             </w:pPr>
             <w:r>
               <w:rPr>
-                <w:rFonts w:ascii="Arial Unicode MS" w:cs="Arial Unicode MS" w:eastAsia="Arial Unicode MS" w:hAnsi="Arial Unicode MS"/>
+                <w:rFonts w:ascii="Heiti SC" w:cs="Arial Unicode MS" w:eastAsia="Heiti SC" w:hAnsi="Heiti SC"/>
                 <w:b/>
                 <w:bCs w:val="1"/>
                 <w:color w:val="ffffff"/>
                 <w:sz w:val="17"/>
                 <w:rtl w:val="0"/>
               </w:rPr>
-              <w:t>Deliverable</w:t>
+              <w:t>交付物</w:t>
             </w:r>
           </w:p>
         </w:tc>
@@ -7357,14 +7383,14 @@
             </w:pPr>
             <w:r>
               <w:rPr>
-                <w:rFonts w:ascii="Arial Unicode MS" w:cs="Arial Unicode MS" w:eastAsia="Arial Unicode MS" w:hAnsi="Arial Unicode MS"/>
+                <w:rFonts w:ascii="Heiti SC" w:cs="Arial Unicode MS" w:eastAsia="Heiti SC" w:hAnsi="Heiti SC"/>
                 <w:b/>
                 <w:bCs w:val="1"/>
                 <w:color w:val="ffffff"/>
                 <w:sz w:val="17"/>
                 <w:rtl w:val="0"/>
               </w:rPr>
-              <w:t>Exit criteria</w:t>
+              <w:t>退出条件</w:t>
             </w:r>
           </w:p>
         </w:tc>
@@ -7400,7 +7426,7 @@
             </w:pPr>
             <w:r>
               <w:rPr>
-                <w:rFonts w:ascii="Arial Unicode MS" w:cs="Arial Unicode MS" w:eastAsia="Arial Unicode MS" w:hAnsi="Arial Unicode MS"/>
+                <w:rFonts w:ascii="Heiti SC" w:cs="Arial Unicode MS" w:eastAsia="Heiti SC" w:hAnsi="Heiti SC"/>
                 <w:b w:val="0"/>
                 <w:color w:val="233447"/>
                 <w:sz w:val="17"/>
@@ -7436,13 +7462,13 @@
             </w:pPr>
             <w:r>
               <w:rPr>
-                <w:rFonts w:ascii="Arial Unicode MS" w:cs="Arial Unicode MS" w:eastAsia="Arial Unicode MS" w:hAnsi="Arial Unicode MS"/>
-                <w:b w:val="0"/>
-                <w:color w:val="233447"/>
-                <w:sz w:val="17"/>
-                <w:rtl w:val="0"/>
-              </w:rPr>
-              <w:t>Authoring Skill, schemas, solution-free scaffold, static validators, and System Design.</w:t>
+                <w:rFonts w:ascii="Heiti SC" w:cs="Arial Unicode MS" w:eastAsia="Heiti SC" w:hAnsi="Heiti SC"/>
+                <w:b w:val="0"/>
+                <w:color w:val="233447"/>
+                <w:sz w:val="17"/>
+                <w:rtl w:val="0"/>
+              </w:rPr>
+              <w:t>Authoring Skill、schema、solution-free脚手架、静态validator和中文系统设计。</w:t>
             </w:r>
           </w:p>
         </w:tc>
@@ -7472,13 +7498,13 @@
             </w:pPr>
             <w:r>
               <w:rPr>
-                <w:rFonts w:ascii="Arial Unicode MS" w:cs="Arial Unicode MS" w:eastAsia="Arial Unicode MS" w:hAnsi="Arial Unicode MS"/>
-                <w:b w:val="0"/>
-                <w:color w:val="233447"/>
-                <w:sz w:val="17"/>
-                <w:rtl w:val="0"/>
-              </w:rPr>
-              <w:t>Skill validator plus negative draft and positive review-ready smoke tests pass.</w:t>
+                <w:rFonts w:ascii="Heiti SC" w:cs="Arial Unicode MS" w:eastAsia="Heiti SC" w:hAnsi="Heiti SC"/>
+                <w:b w:val="0"/>
+                <w:color w:val="233447"/>
+                <w:sz w:val="17"/>
+                <w:rtl w:val="0"/>
+              </w:rPr>
+              <w:t>Skill validator及负向draft、正向review-ready合同测试通过。</w:t>
             </w:r>
           </w:p>
         </w:tc>
@@ -7514,7 +7540,7 @@
             </w:pPr>
             <w:r>
               <w:rPr>
-                <w:rFonts w:ascii="Arial Unicode MS" w:cs="Arial Unicode MS" w:eastAsia="Arial Unicode MS" w:hAnsi="Arial Unicode MS"/>
+                <w:rFonts w:ascii="Heiti SC" w:cs="Arial Unicode MS" w:eastAsia="Heiti SC" w:hAnsi="Heiti SC"/>
                 <w:b w:val="0"/>
                 <w:color w:val="233447"/>
                 <w:sz w:val="17"/>
@@ -7550,13 +7576,13 @@
             </w:pPr>
             <w:r>
               <w:rPr>
-                <w:rFonts w:ascii="Arial Unicode MS" w:cs="Arial Unicode MS" w:eastAsia="Arial Unicode MS" w:hAnsi="Arial Unicode MS"/>
-                <w:b w:val="0"/>
-                <w:color w:val="233447"/>
-                <w:sz w:val="17"/>
-                <w:rtl w:val="0"/>
-              </w:rPr>
-              <w:t>Forward-test 3–5 real PDFs across DFT, MD, and model fitting.</w:t>
+                <w:rFonts w:ascii="Heiti SC" w:cs="Arial Unicode MS" w:eastAsia="Heiti SC" w:hAnsi="Heiti SC"/>
+                <w:b w:val="0"/>
+                <w:color w:val="233447"/>
+                <w:sz w:val="17"/>
+                <w:rtl w:val="0"/>
+              </w:rPr>
+              <w:t>使用DFT、MD和model fitting等3—5篇真实论文做前向测试。</w:t>
             </w:r>
           </w:p>
         </w:tc>
@@ -7586,13 +7612,13 @@
             </w:pPr>
             <w:r>
               <w:rPr>
-                <w:rFonts w:ascii="Arial Unicode MS" w:cs="Arial Unicode MS" w:eastAsia="Arial Unicode MS" w:hAnsi="Arial Unicode MS"/>
-                <w:b w:val="0"/>
-                <w:color w:val="233447"/>
-                <w:sz w:val="17"/>
-                <w:rtl w:val="0"/>
-              </w:rPr>
-              <w:t>Each evidence ledger closes; independent Review failures are reproducible and produce gate revisions.</w:t>
+                <w:rFonts w:ascii="Heiti SC" w:cs="Arial Unicode MS" w:eastAsia="Heiti SC" w:hAnsi="Heiti SC"/>
+                <w:b w:val="0"/>
+                <w:color w:val="233447"/>
+                <w:sz w:val="17"/>
+                <w:rtl w:val="0"/>
+              </w:rPr>
+              <w:t>每份证据台账闭环；独立Review失败可重放并推动门禁修订。</w:t>
             </w:r>
           </w:p>
         </w:tc>
@@ -7628,7 +7654,7 @@
             </w:pPr>
             <w:r>
               <w:rPr>
-                <w:rFonts w:ascii="Arial Unicode MS" w:cs="Arial Unicode MS" w:eastAsia="Arial Unicode MS" w:hAnsi="Arial Unicode MS"/>
+                <w:rFonts w:ascii="Heiti SC" w:cs="Arial Unicode MS" w:eastAsia="Heiti SC" w:hAnsi="Heiti SC"/>
                 <w:b w:val="0"/>
                 <w:color w:val="233447"/>
                 <w:sz w:val="17"/>
@@ -7664,13 +7690,13 @@
             </w:pPr>
             <w:r>
               <w:rPr>
-                <w:rFonts w:ascii="Arial Unicode MS" w:cs="Arial Unicode MS" w:eastAsia="Arial Unicode MS" w:hAnsi="Arial Unicode MS"/>
-                <w:b w:val="0"/>
-                <w:color w:val="233447"/>
-                <w:sz w:val="17"/>
-                <w:rtl w:val="0"/>
-              </w:rPr>
-              <w:t>Stabilize resource deployment mapping and independent Review handoff.</w:t>
+                <w:rFonts w:ascii="Heiti SC" w:cs="Arial Unicode MS" w:eastAsia="Heiti SC" w:hAnsi="Heiti SC"/>
+                <w:b w:val="0"/>
+                <w:color w:val="233447"/>
+                <w:sz w:val="17"/>
+                <w:rtl w:val="0"/>
+              </w:rPr>
+              <w:t>稳定资源部署映射和独立Review交接。</w:t>
             </w:r>
           </w:p>
         </w:tc>
@@ -7700,13 +7726,13 @@
             </w:pPr>
             <w:r>
               <w:rPr>
-                <w:rFonts w:ascii="Arial Unicode MS" w:cs="Arial Unicode MS" w:eastAsia="Arial Unicode MS" w:hAnsi="Arial Unicode MS"/>
-                <w:b w:val="0"/>
-                <w:color w:val="233447"/>
-                <w:sz w:val="17"/>
-                <w:rtl w:val="0"/>
-              </w:rPr>
-              <w:t>Filename-only instruction works locally and in Playground without prompt edits.</w:t>
+                <w:rFonts w:ascii="Heiti SC" w:cs="Arial Unicode MS" w:eastAsia="Heiti SC" w:hAnsi="Heiti SC"/>
+                <w:b w:val="0"/>
+                <w:color w:val="233447"/>
+                <w:sz w:val="17"/>
+                <w:rtl w:val="0"/>
+              </w:rPr>
+              <w:t>只写文件名的instruction无需改题面即可在本地和Playground工作。</w:t>
             </w:r>
           </w:p>
         </w:tc>
@@ -7742,7 +7768,7 @@
             </w:pPr>
             <w:r>
               <w:rPr>
-                <w:rFonts w:ascii="Arial Unicode MS" w:cs="Arial Unicode MS" w:eastAsia="Arial Unicode MS" w:hAnsi="Arial Unicode MS"/>
+                <w:rFonts w:ascii="Heiti SC" w:cs="Arial Unicode MS" w:eastAsia="Heiti SC" w:hAnsi="Heiti SC"/>
                 <w:b w:val="0"/>
                 <w:color w:val="233447"/>
                 <w:sz w:val="17"/>
@@ -7778,13 +7804,13 @@
             </w:pPr>
             <w:r>
               <w:rPr>
-                <w:rFonts w:ascii="Arial Unicode MS" w:cs="Arial Unicode MS" w:eastAsia="Arial Unicode MS" w:hAnsi="Arial Unicode MS"/>
-                <w:b w:val="0"/>
-                <w:color w:val="233447"/>
-                <w:sz w:val="17"/>
-                <w:rtl w:val="0"/>
-              </w:rPr>
-              <w:t>Batch Authoring pilot and first-pass metrics dashboard.</w:t>
+                <w:rFonts w:ascii="Heiti SC" w:cs="Arial Unicode MS" w:eastAsia="Heiti SC" w:hAnsi="Heiti SC"/>
+                <w:b w:val="0"/>
+                <w:color w:val="233447"/>
+                <w:sz w:val="17"/>
+                <w:rtl w:val="0"/>
+              </w:rPr>
+              <w:t>批量Authoring试点和首次通过率指标面板。</w:t>
             </w:r>
           </w:p>
         </w:tc>
@@ -7814,13 +7840,13 @@
             </w:pPr>
             <w:r>
               <w:rPr>
-                <w:rFonts w:ascii="Arial Unicode MS" w:cs="Arial Unicode MS" w:eastAsia="Arial Unicode MS" w:hAnsi="Arial Unicode MS"/>
-                <w:b w:val="0"/>
-                <w:color w:val="233447"/>
-                <w:sz w:val="17"/>
-                <w:rtl w:val="0"/>
-              </w:rPr>
-              <w:t>Enhanced first-pass target is met; Repair demand falls without Gold or resource regressions.</w:t>
+                <w:rFonts w:ascii="Heiti SC" w:cs="Arial Unicode MS" w:eastAsia="Heiti SC" w:hAnsi="Heiti SC"/>
+                <w:b w:val="0"/>
+                <w:color w:val="233447"/>
+                <w:sz w:val="17"/>
+                <w:rtl w:val="0"/>
+              </w:rPr>
+              <w:t>达到增强首次通过率目标；Repair需求下降且不引入Gold或资源回归。</w:t>
             </w:r>
           </w:p>
         </w:tc>
@@ -7893,7 +7919,7 @@
     </w:pPr>
     <w:r>
       <w:rPr>
-        <w:rFonts w:ascii="Arial Unicode MS" w:cs="Arial Unicode MS" w:eastAsia="Arial Unicode MS" w:hAnsi="Arial Unicode MS"/>
+        <w:rFonts w:ascii="Heiti SC" w:cs="Arial Unicode MS" w:eastAsia="Heiti SC" w:hAnsi="Heiti SC"/>
         <w:b w:val="0"/>
         <w:bCs w:val="0"/>
         <w:i w:val="0"/>
@@ -7908,7 +7934,7 @@
         <w:vertAlign w:val="baseline"/>
         <w:rtl w:val="0"/>
       </w:rPr>
-      <w:t>MatBenchGuard | Materials Benchmark Authoring System Design</w:t>
+      <w:t>MatBenchGuard｜材料基准题目编写系统设计</w:t>
     </w:r>
   </w:p>
 </w:ftr>

</xml_diff>